<commit_message>
Report: add Section 3.8, twelve cloud computing modules mapped to CloudPulse
Concept-to-implementation mapping (compute, storage, networking, IAM, governance,
monitoring, economics, FinOps, elasticity, security, automation). Report is now 47 pages.

Co-Authored-By: Claude Sonnet 5.5 <noreply@anthropic.com>
Claude-Session: https://claude.ai/code/session_011YheWLepAW6v3CC9KKGYtG
</commit_message>
<xml_diff>
--- a/cloudpulse/report/output/CloudPulse_Mini_Project_Report.docx
+++ b/cloudpulse/report/output/CloudPulse_Mini_Project_Report.docx
@@ -1102,7 +1102,7 @@
                 <w:rFonts w:ascii="Times New Roman" w:hAnsi="Times New Roman" w:eastAsia="Times New Roman" w:cs="Times New Roman"/>
                 <w:sz w:val="24"/>
               </w:rPr>
-              <w:t>11</w:t>
+              <w:t>15</w:t>
             </w:r>
           </w:p>
         </w:tc>
@@ -1161,7 +1161,7 @@
                 <w:rFonts w:ascii="Times New Roman" w:hAnsi="Times New Roman" w:eastAsia="Times New Roman" w:cs="Times New Roman"/>
                 <w:sz w:val="24"/>
               </w:rPr>
-              <w:t>18</w:t>
+              <w:t>22</w:t>
             </w:r>
           </w:p>
         </w:tc>
@@ -1220,7 +1220,7 @@
                 <w:rFonts w:ascii="Times New Roman" w:hAnsi="Times New Roman" w:eastAsia="Times New Roman" w:cs="Times New Roman"/>
                 <w:sz w:val="24"/>
               </w:rPr>
-              <w:t>26</w:t>
+              <w:t>30</w:t>
             </w:r>
           </w:p>
         </w:tc>
@@ -1279,7 +1279,7 @@
                 <w:rFonts w:ascii="Times New Roman" w:hAnsi="Times New Roman" w:eastAsia="Times New Roman" w:cs="Times New Roman"/>
                 <w:sz w:val="24"/>
               </w:rPr>
-              <w:t>35</w:t>
+              <w:t>39</w:t>
             </w:r>
           </w:p>
         </w:tc>
@@ -1338,7 +1338,7 @@
                 <w:rFonts w:ascii="Times New Roman" w:hAnsi="Times New Roman" w:eastAsia="Times New Roman" w:cs="Times New Roman"/>
                 <w:sz w:val="24"/>
               </w:rPr>
-              <w:t>37</w:t>
+              <w:t>41</w:t>
             </w:r>
           </w:p>
         </w:tc>
@@ -1430,7 +1430,7 @@
                 <w:rFonts w:ascii="Times New Roman" w:hAnsi="Times New Roman" w:eastAsia="Times New Roman" w:cs="Times New Roman"/>
                 <w:sz w:val="19"/>
               </w:rPr>
-              <w:t>13</w:t>
+              <w:t>17</w:t>
             </w:r>
           </w:p>
         </w:tc>
@@ -1470,7 +1470,7 @@
                 <w:rFonts w:ascii="Times New Roman" w:hAnsi="Times New Roman" w:eastAsia="Times New Roman" w:cs="Times New Roman"/>
                 <w:sz w:val="19"/>
               </w:rPr>
-              <w:t>15</w:t>
+              <w:t>19</w:t>
             </w:r>
           </w:p>
         </w:tc>
@@ -1510,7 +1510,7 @@
                 <w:rFonts w:ascii="Times New Roman" w:hAnsi="Times New Roman" w:eastAsia="Times New Roman" w:cs="Times New Roman"/>
                 <w:sz w:val="19"/>
               </w:rPr>
-              <w:t>19</w:t>
+              <w:t>23</w:t>
             </w:r>
           </w:p>
         </w:tc>
@@ -1550,7 +1550,7 @@
                 <w:rFonts w:ascii="Times New Roman" w:hAnsi="Times New Roman" w:eastAsia="Times New Roman" w:cs="Times New Roman"/>
                 <w:sz w:val="19"/>
               </w:rPr>
-              <w:t>22</w:t>
+              <w:t>26</w:t>
             </w:r>
           </w:p>
         </w:tc>
@@ -1590,7 +1590,7 @@
                 <w:rFonts w:ascii="Times New Roman" w:hAnsi="Times New Roman" w:eastAsia="Times New Roman" w:cs="Times New Roman"/>
                 <w:sz w:val="19"/>
               </w:rPr>
-              <w:t>23</w:t>
+              <w:t>27</w:t>
             </w:r>
           </w:p>
         </w:tc>
@@ -1630,7 +1630,7 @@
                 <w:rFonts w:ascii="Times New Roman" w:hAnsi="Times New Roman" w:eastAsia="Times New Roman" w:cs="Times New Roman"/>
                 <w:sz w:val="19"/>
               </w:rPr>
-              <w:t>26</w:t>
+              <w:t>30</w:t>
             </w:r>
           </w:p>
         </w:tc>
@@ -1670,7 +1670,7 @@
                 <w:rFonts w:ascii="Times New Roman" w:hAnsi="Times New Roman" w:eastAsia="Times New Roman" w:cs="Times New Roman"/>
                 <w:sz w:val="19"/>
               </w:rPr>
-              <w:t>27</w:t>
+              <w:t>31</w:t>
             </w:r>
           </w:p>
         </w:tc>
@@ -1710,7 +1710,7 @@
                 <w:rFonts w:ascii="Times New Roman" w:hAnsi="Times New Roman" w:eastAsia="Times New Roman" w:cs="Times New Roman"/>
                 <w:sz w:val="19"/>
               </w:rPr>
-              <w:t>29</w:t>
+              <w:t>33</w:t>
             </w:r>
           </w:p>
         </w:tc>
@@ -1750,7 +1750,7 @@
                 <w:rFonts w:ascii="Times New Roman" w:hAnsi="Times New Roman" w:eastAsia="Times New Roman" w:cs="Times New Roman"/>
                 <w:sz w:val="19"/>
               </w:rPr>
-              <w:t>30</w:t>
+              <w:t>34</w:t>
             </w:r>
           </w:p>
         </w:tc>
@@ -1790,7 +1790,7 @@
                 <w:rFonts w:ascii="Times New Roman" w:hAnsi="Times New Roman" w:eastAsia="Times New Roman" w:cs="Times New Roman"/>
                 <w:sz w:val="19"/>
               </w:rPr>
-              <w:t>31</w:t>
+              <w:t>35</w:t>
             </w:r>
           </w:p>
         </w:tc>
@@ -2077,7 +2077,7 @@
                 <w:rFonts w:ascii="Times New Roman" w:hAnsi="Times New Roman" w:eastAsia="Times New Roman" w:cs="Times New Roman"/>
                 <w:sz w:val="19"/>
               </w:rPr>
-              <w:t>Table 4.1  Numbered flows in Figure 4.1</w:t>
+              <w:t>Table 3.4  Cloud computing modules and where CloudPulse applies them</w:t>
             </w:r>
           </w:p>
         </w:tc>
@@ -2117,7 +2117,7 @@
                 <w:rFonts w:ascii="Times New Roman" w:hAnsi="Times New Roman" w:eastAsia="Times New Roman" w:cs="Times New Roman"/>
                 <w:sz w:val="19"/>
               </w:rPr>
-              <w:t>Table 4.2  Three ways CloudPulse can sign in to Azure</w:t>
+              <w:t>Table 4.1  Numbered flows in Figure 4.1</w:t>
             </w:r>
           </w:p>
         </w:tc>
@@ -2136,7 +2136,7 @@
                 <w:rFonts w:ascii="Times New Roman" w:hAnsi="Times New Roman" w:eastAsia="Times New Roman" w:cs="Times New Roman"/>
                 <w:sz w:val="19"/>
               </w:rPr>
-              <w:t>14</w:t>
+              <w:t>18</w:t>
             </w:r>
           </w:p>
         </w:tc>
@@ -2157,7 +2157,7 @@
                 <w:rFonts w:ascii="Times New Roman" w:hAnsi="Times New Roman" w:eastAsia="Times New Roman" w:cs="Times New Roman"/>
                 <w:sz w:val="19"/>
               </w:rPr>
-              <w:t>Table 4.3  Database tables</w:t>
+              <w:t>Table 4.2  Three ways CloudPulse can sign in to Azure</w:t>
             </w:r>
           </w:p>
         </w:tc>
@@ -2176,7 +2176,7 @@
                 <w:rFonts w:ascii="Times New Roman" w:hAnsi="Times New Roman" w:eastAsia="Times New Roman" w:cs="Times New Roman"/>
                 <w:sz w:val="19"/>
               </w:rPr>
-              <w:t>16</w:t>
+              <w:t>18</w:t>
             </w:r>
           </w:p>
         </w:tc>
@@ -2197,7 +2197,7 @@
                 <w:rFonts w:ascii="Times New Roman" w:hAnsi="Times New Roman" w:eastAsia="Times New Roman" w:cs="Times New Roman"/>
                 <w:sz w:val="19"/>
               </w:rPr>
-              <w:t>Table 4.4  Threats and the controls that address them</w:t>
+              <w:t>Table 4.3  Database tables</w:t>
             </w:r>
           </w:p>
         </w:tc>
@@ -2216,7 +2216,7 @@
                 <w:rFonts w:ascii="Times New Roman" w:hAnsi="Times New Roman" w:eastAsia="Times New Roman" w:cs="Times New Roman"/>
                 <w:sz w:val="19"/>
               </w:rPr>
-              <w:t>17</w:t>
+              <w:t>20</w:t>
             </w:r>
           </w:p>
         </w:tc>
@@ -2237,7 +2237,7 @@
                 <w:rFonts w:ascii="Times New Roman" w:hAnsi="Times New Roman" w:eastAsia="Times New Roman" w:cs="Times New Roman"/>
                 <w:sz w:val="19"/>
               </w:rPr>
-              <w:t>Table 5.1  Waste detection rules applied to the Azure inventory</w:t>
+              <w:t>Table 4.4  Threats and the controls that address them</w:t>
             </w:r>
           </w:p>
         </w:tc>
@@ -2256,7 +2256,7 @@
                 <w:rFonts w:ascii="Times New Roman" w:hAnsi="Times New Roman" w:eastAsia="Times New Roman" w:cs="Times New Roman"/>
                 <w:sz w:val="19"/>
               </w:rPr>
-              <w:t>20</w:t>
+              <w:t>21</w:t>
             </w:r>
           </w:p>
         </w:tc>
@@ -2277,7 +2277,7 @@
                 <w:rFonts w:ascii="Times New Roman" w:hAnsi="Times New Roman" w:eastAsia="Times New Roman" w:cs="Times New Roman"/>
                 <w:sz w:val="19"/>
               </w:rPr>
-              <w:t>Table 5.2  Azure scripts</w:t>
+              <w:t>Table 5.1  Waste detection rules applied to the Azure inventory</w:t>
             </w:r>
           </w:p>
         </w:tc>
@@ -2317,7 +2317,7 @@
                 <w:rFonts w:ascii="Times New Roman" w:hAnsi="Times New Roman" w:eastAsia="Times New Roman" w:cs="Times New Roman"/>
                 <w:sz w:val="19"/>
               </w:rPr>
-              <w:t>Table 5.3  Waste planted by 02-leaks.sh and the finding CloudPulse raises</w:t>
+              <w:t>Table 5.2  Azure scripts</w:t>
             </w:r>
           </w:p>
         </w:tc>
@@ -2336,7 +2336,7 @@
                 <w:rFonts w:ascii="Times New Roman" w:hAnsi="Times New Roman" w:eastAsia="Times New Roman" w:cs="Times New Roman"/>
                 <w:sz w:val="19"/>
               </w:rPr>
-              <w:t>24</w:t>
+              <w:t>28</w:t>
             </w:r>
           </w:p>
         </w:tc>
@@ -2357,7 +2357,7 @@
                 <w:rFonts w:ascii="Times New Roman" w:hAnsi="Times New Roman" w:eastAsia="Times New Roman" w:cs="Times New Roman"/>
                 <w:sz w:val="19"/>
               </w:rPr>
-              <w:t>Table 5.4  Automated tests (27)</w:t>
+              <w:t>Table 5.3  Waste planted by 02-leaks.sh and the finding CloudPulse raises</w:t>
             </w:r>
           </w:p>
         </w:tc>
@@ -2376,7 +2376,7 @@
                 <w:rFonts w:ascii="Times New Roman" w:hAnsi="Times New Roman" w:eastAsia="Times New Roman" w:cs="Times New Roman"/>
                 <w:sz w:val="19"/>
               </w:rPr>
-              <w:t>25</w:t>
+              <w:t>28</w:t>
             </w:r>
           </w:p>
         </w:tc>
@@ -2397,7 +2397,7 @@
                 <w:rFonts w:ascii="Times New Roman" w:hAnsi="Times New Roman" w:eastAsia="Times New Roman" w:cs="Times New Roman"/>
                 <w:sz w:val="19"/>
               </w:rPr>
-              <w:t>Table 6.1  Set-up used for the results in this chapter</w:t>
+              <w:t>Table 5.4  Automated tests (27)</w:t>
             </w:r>
           </w:p>
         </w:tc>
@@ -2416,7 +2416,7 @@
                 <w:rFonts w:ascii="Times New Roman" w:hAnsi="Times New Roman" w:eastAsia="Times New Roman" w:cs="Times New Roman"/>
                 <w:sz w:val="19"/>
               </w:rPr>
-              <w:t>26</w:t>
+              <w:t>29</w:t>
             </w:r>
           </w:p>
         </w:tc>
@@ -2437,7 +2437,7 @@
                 <w:rFonts w:ascii="Times New Roman" w:hAnsi="Times New Roman" w:eastAsia="Times New Roman" w:cs="Times New Roman"/>
                 <w:sz w:val="19"/>
               </w:rPr>
-              <w:t>Table 6.2  Findings in the demo workspace (impact in USD per month)</w:t>
+              <w:t>Table 6.1  Set-up used for the results in this chapter</w:t>
             </w:r>
           </w:p>
         </w:tc>
@@ -2456,7 +2456,7 @@
                 <w:rFonts w:ascii="Times New Roman" w:hAnsi="Times New Roman" w:eastAsia="Times New Roman" w:cs="Times New Roman"/>
                 <w:sz w:val="19"/>
               </w:rPr>
-              <w:t>32</w:t>
+              <w:t>30</w:t>
             </w:r>
           </w:p>
         </w:tc>
@@ -2477,7 +2477,7 @@
                 <w:rFonts w:ascii="Times New Roman" w:hAnsi="Times New Roman" w:eastAsia="Times New Roman" w:cs="Times New Roman"/>
                 <w:sz w:val="19"/>
               </w:rPr>
-              <w:t>Table 6.3  Verified savings in the demo workspace</w:t>
+              <w:t>Table 6.2  Findings in the demo workspace (impact in USD per month)</w:t>
             </w:r>
           </w:p>
         </w:tc>
@@ -2496,7 +2496,7 @@
                 <w:rFonts w:ascii="Times New Roman" w:hAnsi="Times New Roman" w:eastAsia="Times New Roman" w:cs="Times New Roman"/>
                 <w:sz w:val="19"/>
               </w:rPr>
-              <w:t>32</w:t>
+              <w:t>36</w:t>
             </w:r>
           </w:p>
         </w:tc>
@@ -2517,7 +2517,7 @@
                 <w:rFonts w:ascii="Times New Roman" w:hAnsi="Times New Roman" w:eastAsia="Times New Roman" w:cs="Times New Roman"/>
                 <w:sz w:val="19"/>
               </w:rPr>
-              <w:t>Table 6.4  Automated test run (pytest)</w:t>
+              <w:t>Table 6.3  Verified savings in the demo workspace</w:t>
             </w:r>
           </w:p>
         </w:tc>
@@ -2536,7 +2536,7 @@
                 <w:rFonts w:ascii="Times New Roman" w:hAnsi="Times New Roman" w:eastAsia="Times New Roman" w:cs="Times New Roman"/>
                 <w:sz w:val="19"/>
               </w:rPr>
-              <w:t>33</w:t>
+              <w:t>36</w:t>
             </w:r>
           </w:p>
         </w:tc>
@@ -2557,7 +2557,7 @@
                 <w:rFonts w:ascii="Times New Roman" w:hAnsi="Times New Roman" w:eastAsia="Times New Roman" w:cs="Times New Roman"/>
                 <w:sz w:val="19"/>
               </w:rPr>
-              <w:t>Table 6.5  Validation checklist for a live subscription</w:t>
+              <w:t>Table 6.4  Automated test run (pytest)</w:t>
             </w:r>
           </w:p>
         </w:tc>
@@ -2576,7 +2576,47 @@
                 <w:rFonts w:ascii="Times New Roman" w:hAnsi="Times New Roman" w:eastAsia="Times New Roman" w:cs="Times New Roman"/>
                 <w:sz w:val="19"/>
               </w:rPr>
-              <w:t>33</w:t>
+              <w:t>37</w:t>
+            </w:r>
+          </w:p>
+        </w:tc>
+      </w:tr>
+      <w:tr>
+        <w:tc>
+          <w:tcPr>
+            <w:tcW w:type="dxa" w:w="7937"/>
+          </w:tcPr>
+          <w:p>
+            <w:pPr>
+              <w:spacing w:line="240" w:lineRule="auto" w:after="0"/>
+              <w:jc w:val="left"/>
+            </w:pPr>
+            <w:r/>
+            <w:r>
+              <w:rPr>
+                <w:rFonts w:ascii="Times New Roman" w:hAnsi="Times New Roman" w:eastAsia="Times New Roman" w:cs="Times New Roman"/>
+                <w:sz w:val="19"/>
+              </w:rPr>
+              <w:t>Table 6.5  Validation checklist for a live subscription</w:t>
+            </w:r>
+          </w:p>
+        </w:tc>
+        <w:tc>
+          <w:tcPr>
+            <w:tcW w:type="dxa" w:w="850"/>
+          </w:tcPr>
+          <w:p>
+            <w:pPr>
+              <w:spacing w:line="240" w:lineRule="auto" w:after="0"/>
+              <w:jc w:val="right"/>
+            </w:pPr>
+            <w:r/>
+            <w:r>
+              <w:rPr>
+                <w:rFonts w:ascii="Times New Roman" w:hAnsi="Times New Roman" w:eastAsia="Times New Roman" w:cs="Times New Roman"/>
+                <w:sz w:val="19"/>
+              </w:rPr>
+              <w:t>37</w:t>
             </w:r>
           </w:p>
         </w:tc>
@@ -4586,7 +4626,7 @@
           <w:i w:val="0"/>
           <w:sz w:val="24"/>
         </w:rPr>
-        <w:t>Chapter 2 states the objectives and requirements. Chapter 3 lists the tools and technologies. Chapter 4 presents the system architecture, including how Azure credentials are created, stored and used. Chapter 5 explains the methodology: data collection, detection rules, the anomaly, forecast, priority and verification algorithms, the finding lifecycle and the test environment. Chapter 6 shows and explains the results with screenshots of the running application. Chapter 7 concludes the report and Chapter 8 lists the references.</w:t>
+        <w:t>Chapter 2 states the objectives and requirements. Chapter 3 lists the tools and technologies and the cloud computing concepts applied. Chapter 4 presents the system architecture, including how Azure credentials are created, stored and used. Chapter 5 explains the methodology: data collection, detection rules, the anomaly, forecast, priority and verification algorithms, the finding lifecycle and the test environment. Chapter 6 shows and explains the results with screenshots of the running application. Chapter 7 concludes the report and Chapter 8 lists the references.</w:t>
       </w:r>
     </w:p>
     <w:p>
@@ -9192,6 +9232,2045 @@
                 <w:sz w:val="21"/>
               </w:rPr>
               <w:t>Automated tests and API test client</w:t>
+            </w:r>
+          </w:p>
+        </w:tc>
+      </w:tr>
+    </w:tbl>
+    <w:p>
+      <w:pPr>
+        <w:spacing w:before="0" w:after="80" w:line="240" w:lineRule="auto"/>
+        <w:jc w:val="both"/>
+      </w:pPr>
+    </w:p>
+    <w:p>
+      <w:pPr>
+        <w:pStyle w:val="Heading2"/>
+      </w:pPr>
+      <w:r>
+        <w:rPr>
+          <w:rFonts w:ascii="Times New Roman" w:hAnsi="Times New Roman" w:eastAsia="Times New Roman" w:cs="Times New Roman"/>
+          <w:b/>
+          <w:i w:val="0"/>
+          <w:sz w:val="25"/>
+        </w:rPr>
+        <w:t>3.8  Cloud Computing Concepts Applied in the Project</w:t>
+      </w:r>
+    </w:p>
+    <w:p>
+      <w:pPr>
+        <w:spacing w:before="0" w:after="120" w:line="360" w:lineRule="auto"/>
+        <w:jc w:val="both"/>
+      </w:pPr>
+      <w:r>
+        <w:rPr>
+          <w:rFonts w:ascii="Times New Roman" w:hAnsi="Times New Roman" w:eastAsia="Times New Roman" w:cs="Times New Roman"/>
+          <w:b w:val="0"/>
+          <w:i w:val="0"/>
+          <w:sz w:val="24"/>
+        </w:rPr>
+        <w:t>CloudPulse sits on top of several standard cloud computing topics. This section presents them as twelve short modules. Each module states the concept in brief and then the exact place where CloudPulse uses it, so that the theory can be traced to the implementation. Table 3.4 at the end of the section summarises the mapping.</w:t>
+      </w:r>
+    </w:p>
+    <w:p>
+      <w:pPr>
+        <w:pStyle w:val="Heading3"/>
+      </w:pPr>
+      <w:r>
+        <w:rPr>
+          <w:rFonts w:ascii="Times New Roman" w:hAnsi="Times New Roman" w:eastAsia="Times New Roman" w:cs="Times New Roman"/>
+          <w:b/>
+          <w:i/>
+          <w:sz w:val="24"/>
+        </w:rPr>
+        <w:t>Module 1: Cloud service and deployment models</w:t>
+      </w:r>
+    </w:p>
+    <w:p>
+      <w:pPr>
+        <w:spacing w:before="0" w:after="120" w:line="360" w:lineRule="auto"/>
+        <w:jc w:val="both"/>
+      </w:pPr>
+      <w:r>
+        <w:rPr>
+          <w:rFonts w:ascii="Times New Roman" w:hAnsi="Times New Roman" w:eastAsia="Times New Roman" w:cs="Times New Roman"/>
+          <w:b/>
+          <w:i w:val="0"/>
+          <w:sz w:val="24"/>
+        </w:rPr>
+        <w:t>Concept.</w:t>
+      </w:r>
+      <w:r>
+        <w:rPr>
+          <w:rFonts w:ascii="Times New Roman" w:hAnsi="Times New Roman" w:eastAsia="Times New Roman" w:cs="Times New Roman"/>
+          <w:b w:val="0"/>
+          <w:i w:val="0"/>
+          <w:sz w:val="24"/>
+        </w:rPr>
+        <w:t xml:space="preserve"> Cloud services are offered as Infrastructure as a Service (IaaS: virtual machines, disks and networks that the customer manages), Platform as a Service (PaaS: a managed run-time such as Azure App Service) and Software as a Service (SaaS: a finished application). Deployment models are public, private and hybrid cloud. Billing is pay-as-you-go: cost follows consumption.</w:t>
+      </w:r>
+    </w:p>
+    <w:p>
+      <w:pPr>
+        <w:spacing w:before="0" w:after="120" w:line="360" w:lineRule="auto"/>
+        <w:jc w:val="both"/>
+      </w:pPr>
+      <w:r>
+        <w:rPr>
+          <w:rFonts w:ascii="Times New Roman" w:hAnsi="Times New Roman" w:eastAsia="Times New Roman" w:cs="Times New Roman"/>
+          <w:b/>
+          <w:i w:val="0"/>
+          <w:sz w:val="24"/>
+        </w:rPr>
+        <w:t>Applied in CloudPulse.</w:t>
+      </w:r>
+      <w:r>
+        <w:rPr>
+          <w:rFonts w:ascii="Times New Roman" w:hAnsi="Times New Roman" w:eastAsia="Times New Roman" w:cs="Times New Roman"/>
+          <w:b w:val="0"/>
+          <w:i w:val="0"/>
+          <w:sz w:val="24"/>
+        </w:rPr>
+        <w:t xml:space="preserve"> CloudPulse monitors IaaS resources (VMs, disks, public IPs, snapshots) that carry most avoidable cost, can itself be deployed as PaaS on App Service, and is delivered to users as a SaaS-style web application with one workspace per customer.</w:t>
+      </w:r>
+    </w:p>
+    <w:p>
+      <w:pPr>
+        <w:pStyle w:val="Heading3"/>
+      </w:pPr>
+      <w:r>
+        <w:rPr>
+          <w:rFonts w:ascii="Times New Roman" w:hAnsi="Times New Roman" w:eastAsia="Times New Roman" w:cs="Times New Roman"/>
+          <w:b/>
+          <w:i/>
+          <w:sz w:val="24"/>
+        </w:rPr>
+        <w:t>Module 2: Virtualisation and compute</w:t>
+      </w:r>
+    </w:p>
+    <w:p>
+      <w:pPr>
+        <w:spacing w:before="0" w:after="120" w:line="360" w:lineRule="auto"/>
+        <w:jc w:val="both"/>
+      </w:pPr>
+      <w:r>
+        <w:rPr>
+          <w:rFonts w:ascii="Times New Roman" w:hAnsi="Times New Roman" w:eastAsia="Times New Roman" w:cs="Times New Roman"/>
+          <w:b/>
+          <w:i w:val="0"/>
+          <w:sz w:val="24"/>
+        </w:rPr>
+        <w:t>Concept.</w:t>
+      </w:r>
+      <w:r>
+        <w:rPr>
+          <w:rFonts w:ascii="Times New Roman" w:hAnsi="Times New Roman" w:eastAsia="Times New Roman" w:cs="Times New Roman"/>
+          <w:b w:val="0"/>
+          <w:i w:val="0"/>
+          <w:sz w:val="24"/>
+        </w:rPr>
+        <w:t xml:space="preserve"> A virtual machine is a slice of a physical host with a chosen size (vCPU and memory). Burstable B-series sizes suit light workloads. A VM has a power state: when it is shut down from inside the operating system it is </w:t>
+      </w:r>
+      <w:r>
+        <w:rPr>
+          <w:rFonts w:ascii="Times New Roman" w:hAnsi="Times New Roman" w:eastAsia="Times New Roman" w:cs="Times New Roman"/>
+          <w:b w:val="0"/>
+          <w:i/>
+          <w:sz w:val="24"/>
+        </w:rPr>
+        <w:t>stopped</w:t>
+      </w:r>
+      <w:r>
+        <w:rPr>
+          <w:rFonts w:ascii="Times New Roman" w:hAnsi="Times New Roman" w:eastAsia="Times New Roman" w:cs="Times New Roman"/>
+          <w:b w:val="0"/>
+          <w:i w:val="0"/>
+          <w:sz w:val="24"/>
+        </w:rPr>
+        <w:t xml:space="preserve"> but the hardware stays reserved and compute is still billed; only </w:t>
+      </w:r>
+      <w:r>
+        <w:rPr>
+          <w:rFonts w:ascii="Times New Roman" w:hAnsi="Times New Roman" w:eastAsia="Times New Roman" w:cs="Times New Roman"/>
+          <w:b w:val="0"/>
+          <w:i/>
+          <w:sz w:val="24"/>
+        </w:rPr>
+        <w:t>deallocated</w:t>
+      </w:r>
+      <w:r>
+        <w:rPr>
+          <w:rFonts w:ascii="Times New Roman" w:hAnsi="Times New Roman" w:eastAsia="Times New Roman" w:cs="Times New Roman"/>
+          <w:b w:val="0"/>
+          <w:i w:val="0"/>
+          <w:sz w:val="24"/>
+        </w:rPr>
+        <w:t xml:space="preserve"> releases the hardware and stops the compute charge.</w:t>
+      </w:r>
+    </w:p>
+    <w:p>
+      <w:pPr>
+        <w:spacing w:before="0" w:after="120" w:line="360" w:lineRule="auto"/>
+        <w:jc w:val="both"/>
+      </w:pPr>
+      <w:r>
+        <w:rPr>
+          <w:rFonts w:ascii="Times New Roman" w:hAnsi="Times New Roman" w:eastAsia="Times New Roman" w:cs="Times New Roman"/>
+          <w:b/>
+          <w:i w:val="0"/>
+          <w:sz w:val="24"/>
+        </w:rPr>
+        <w:t>Applied in CloudPulse.</w:t>
+      </w:r>
+      <w:r>
+        <w:rPr>
+          <w:rFonts w:ascii="Times New Roman" w:hAnsi="Times New Roman" w:eastAsia="Times New Roman" w:cs="Times New Roman"/>
+          <w:b w:val="0"/>
+          <w:i w:val="0"/>
+          <w:sz w:val="24"/>
+        </w:rPr>
+        <w:t xml:space="preserve"> The detector in </w:t>
+      </w:r>
+      <w:r>
+        <w:rPr>
+          <w:rFonts w:ascii="Courier New" w:hAnsi="Courier New" w:eastAsia="Courier New" w:cs="Courier New"/>
+          <w:b w:val="0"/>
+          <w:i w:val="0"/>
+          <w:sz w:val="22"/>
+        </w:rPr>
+        <w:t>azure_collector.find_stopped_vms</w:t>
+      </w:r>
+      <w:r>
+        <w:rPr>
+          <w:rFonts w:ascii="Times New Roman" w:hAnsi="Times New Roman" w:eastAsia="Times New Roman" w:cs="Times New Roman"/>
+          <w:b w:val="0"/>
+          <w:i w:val="0"/>
+          <w:sz w:val="24"/>
+        </w:rPr>
+        <w:t xml:space="preserve"> separates the two states, and </w:t>
+      </w:r>
+      <w:r>
+        <w:rPr>
+          <w:rFonts w:ascii="Courier New" w:hAnsi="Courier New" w:eastAsia="Courier New" w:cs="Courier New"/>
+          <w:b w:val="0"/>
+          <w:i w:val="0"/>
+          <w:sz w:val="22"/>
+        </w:rPr>
+        <w:t>analytics.vm_verdict</w:t>
+      </w:r>
+      <w:r>
+        <w:rPr>
+          <w:rFonts w:ascii="Times New Roman" w:hAnsi="Times New Roman" w:eastAsia="Times New Roman" w:cs="Times New Roman"/>
+          <w:b w:val="0"/>
+          <w:i w:val="0"/>
+          <w:sz w:val="24"/>
+        </w:rPr>
+        <w:t xml:space="preserve"> classifies running VMs as idle, oversized or fine from CPU and network metrics. The fix commands it suggests are </w:t>
+      </w:r>
+      <w:r>
+        <w:rPr>
+          <w:rFonts w:ascii="Courier New" w:hAnsi="Courier New" w:eastAsia="Courier New" w:cs="Courier New"/>
+          <w:b w:val="0"/>
+          <w:i w:val="0"/>
+          <w:sz w:val="22"/>
+        </w:rPr>
+        <w:t>az vm deallocate</w:t>
+      </w:r>
+      <w:r>
+        <w:rPr>
+          <w:rFonts w:ascii="Times New Roman" w:hAnsi="Times New Roman" w:eastAsia="Times New Roman" w:cs="Times New Roman"/>
+          <w:b w:val="0"/>
+          <w:i w:val="0"/>
+          <w:sz w:val="24"/>
+        </w:rPr>
+        <w:t xml:space="preserve"> and </w:t>
+      </w:r>
+      <w:r>
+        <w:rPr>
+          <w:rFonts w:ascii="Courier New" w:hAnsi="Courier New" w:eastAsia="Courier New" w:cs="Courier New"/>
+          <w:b w:val="0"/>
+          <w:i w:val="0"/>
+          <w:sz w:val="22"/>
+        </w:rPr>
+        <w:t>az vm delete</w:t>
+      </w:r>
+      <w:r>
+        <w:rPr>
+          <w:rFonts w:ascii="Times New Roman" w:hAnsi="Times New Roman" w:eastAsia="Times New Roman" w:cs="Times New Roman"/>
+          <w:b w:val="0"/>
+          <w:i w:val="0"/>
+          <w:sz w:val="24"/>
+        </w:rPr>
+        <w:t>.</w:t>
+      </w:r>
+    </w:p>
+    <w:p>
+      <w:pPr>
+        <w:pStyle w:val="Heading3"/>
+      </w:pPr>
+      <w:r>
+        <w:rPr>
+          <w:rFonts w:ascii="Times New Roman" w:hAnsi="Times New Roman" w:eastAsia="Times New Roman" w:cs="Times New Roman"/>
+          <w:b/>
+          <w:i/>
+          <w:sz w:val="24"/>
+        </w:rPr>
+        <w:t>Module 3: Cloud storage</w:t>
+      </w:r>
+    </w:p>
+    <w:p>
+      <w:pPr>
+        <w:spacing w:before="0" w:after="120" w:line="360" w:lineRule="auto"/>
+        <w:jc w:val="both"/>
+      </w:pPr>
+      <w:r>
+        <w:rPr>
+          <w:rFonts w:ascii="Times New Roman" w:hAnsi="Times New Roman" w:eastAsia="Times New Roman" w:cs="Times New Roman"/>
+          <w:b/>
+          <w:i w:val="0"/>
+          <w:sz w:val="24"/>
+        </w:rPr>
+        <w:t>Concept.</w:t>
+      </w:r>
+      <w:r>
+        <w:rPr>
+          <w:rFonts w:ascii="Times New Roman" w:hAnsi="Times New Roman" w:eastAsia="Times New Roman" w:cs="Times New Roman"/>
+          <w:b w:val="0"/>
+          <w:i w:val="0"/>
+          <w:sz w:val="24"/>
+        </w:rPr>
+        <w:t xml:space="preserve"> Azure managed disks come in tiers (Standard HDD, Standard SSD and Premium SSD) and are billed per provisioned gigabyte whether or not a VM is using them. A snapshot is a point-in-time copy of a disk and is also billed by size. Detaching a VM does not delete its disks.</w:t>
+      </w:r>
+    </w:p>
+    <w:p>
+      <w:pPr>
+        <w:spacing w:before="0" w:after="120" w:line="360" w:lineRule="auto"/>
+        <w:jc w:val="both"/>
+      </w:pPr>
+      <w:r>
+        <w:rPr>
+          <w:rFonts w:ascii="Times New Roman" w:hAnsi="Times New Roman" w:eastAsia="Times New Roman" w:cs="Times New Roman"/>
+          <w:b/>
+          <w:i w:val="0"/>
+          <w:sz w:val="24"/>
+        </w:rPr>
+        <w:t>Applied in CloudPulse.</w:t>
+      </w:r>
+      <w:r>
+        <w:rPr>
+          <w:rFonts w:ascii="Times New Roman" w:hAnsi="Times New Roman" w:eastAsia="Times New Roman" w:cs="Times New Roman"/>
+          <w:b w:val="0"/>
+          <w:i w:val="0"/>
+          <w:sz w:val="24"/>
+        </w:rPr>
+        <w:t xml:space="preserve"> Unattached disks (</w:t>
+      </w:r>
+      <w:r>
+        <w:rPr>
+          <w:rFonts w:ascii="Courier New" w:hAnsi="Courier New" w:eastAsia="Courier New" w:cs="Courier New"/>
+          <w:b w:val="0"/>
+          <w:i w:val="0"/>
+          <w:sz w:val="22"/>
+        </w:rPr>
+        <w:t>diskState = Unattached</w:t>
+      </w:r>
+      <w:r>
+        <w:rPr>
+          <w:rFonts w:ascii="Times New Roman" w:hAnsi="Times New Roman" w:eastAsia="Times New Roman" w:cs="Times New Roman"/>
+          <w:b w:val="0"/>
+          <w:i w:val="0"/>
+          <w:sz w:val="24"/>
+        </w:rPr>
+        <w:t xml:space="preserve">) and orphaned or old snapshots are two of the four waste rules in Table 5.1. </w:t>
+      </w:r>
+      <w:r>
+        <w:rPr>
+          <w:rFonts w:ascii="Courier New" w:hAnsi="Courier New" w:eastAsia="Courier New" w:cs="Courier New"/>
+          <w:b w:val="0"/>
+          <w:i w:val="0"/>
+          <w:sz w:val="22"/>
+        </w:rPr>
+        <w:t>prices.py</w:t>
+      </w:r>
+      <w:r>
+        <w:rPr>
+          <w:rFonts w:ascii="Times New Roman" w:hAnsi="Times New Roman" w:eastAsia="Times New Roman" w:cs="Times New Roman"/>
+          <w:b w:val="0"/>
+          <w:i w:val="0"/>
+          <w:sz w:val="24"/>
+        </w:rPr>
+        <w:t xml:space="preserve"> converts size and tier to a monthly figure.</w:t>
+      </w:r>
+    </w:p>
+    <w:p>
+      <w:pPr>
+        <w:pStyle w:val="Heading3"/>
+      </w:pPr>
+      <w:r>
+        <w:rPr>
+          <w:rFonts w:ascii="Times New Roman" w:hAnsi="Times New Roman" w:eastAsia="Times New Roman" w:cs="Times New Roman"/>
+          <w:b/>
+          <w:i/>
+          <w:sz w:val="24"/>
+        </w:rPr>
+        <w:t>Module 4: Cloud networking</w:t>
+      </w:r>
+    </w:p>
+    <w:p>
+      <w:pPr>
+        <w:spacing w:before="0" w:after="120" w:line="360" w:lineRule="auto"/>
+        <w:jc w:val="both"/>
+      </w:pPr>
+      <w:r>
+        <w:rPr>
+          <w:rFonts w:ascii="Times New Roman" w:hAnsi="Times New Roman" w:eastAsia="Times New Roman" w:cs="Times New Roman"/>
+          <w:b/>
+          <w:i w:val="0"/>
+          <w:sz w:val="24"/>
+        </w:rPr>
+        <w:t>Concept.</w:t>
+      </w:r>
+      <w:r>
+        <w:rPr>
+          <w:rFonts w:ascii="Times New Roman" w:hAnsi="Times New Roman" w:eastAsia="Times New Roman" w:cs="Times New Roman"/>
+          <w:b w:val="0"/>
+          <w:i w:val="0"/>
+          <w:sz w:val="24"/>
+        </w:rPr>
+        <w:t xml:space="preserve"> A public IP address is a separate billable resource that can be associated with a network interface, a load balancer or a NAT gateway. A Standard-SKU static address is charged by the hour even when it is attached to nothing, while a dynamic address with nothing attached has no address and costs nothing.</w:t>
+      </w:r>
+    </w:p>
+    <w:p>
+      <w:pPr>
+        <w:spacing w:before="0" w:after="120" w:line="360" w:lineRule="auto"/>
+        <w:jc w:val="both"/>
+      </w:pPr>
+      <w:r>
+        <w:rPr>
+          <w:rFonts w:ascii="Times New Roman" w:hAnsi="Times New Roman" w:eastAsia="Times New Roman" w:cs="Times New Roman"/>
+          <w:b/>
+          <w:i w:val="0"/>
+          <w:sz w:val="24"/>
+        </w:rPr>
+        <w:t>Applied in CloudPulse.</w:t>
+      </w:r>
+      <w:r>
+        <w:rPr>
+          <w:rFonts w:ascii="Times New Roman" w:hAnsi="Times New Roman" w:eastAsia="Times New Roman" w:cs="Times New Roman"/>
+          <w:b w:val="0"/>
+          <w:i w:val="0"/>
+          <w:sz w:val="24"/>
+        </w:rPr>
+        <w:t xml:space="preserve"> </w:t>
+      </w:r>
+      <w:r>
+        <w:rPr>
+          <w:rFonts w:ascii="Courier New" w:hAnsi="Courier New" w:eastAsia="Courier New" w:cs="Courier New"/>
+          <w:b w:val="0"/>
+          <w:i w:val="0"/>
+          <w:sz w:val="22"/>
+        </w:rPr>
+        <w:t>find_idle_public_ips</w:t>
+      </w:r>
+      <w:r>
+        <w:rPr>
+          <w:rFonts w:ascii="Times New Roman" w:hAnsi="Times New Roman" w:eastAsia="Times New Roman" w:cs="Times New Roman"/>
+          <w:b w:val="0"/>
+          <w:i w:val="0"/>
+          <w:sz w:val="24"/>
+        </w:rPr>
+        <w:t xml:space="preserve"> reports static addresses with no </w:t>
+      </w:r>
+      <w:r>
+        <w:rPr>
+          <w:rFonts w:ascii="Courier New" w:hAnsi="Courier New" w:eastAsia="Courier New" w:cs="Courier New"/>
+          <w:b w:val="0"/>
+          <w:i w:val="0"/>
+          <w:sz w:val="22"/>
+        </w:rPr>
+        <w:t>ipConfiguration</w:t>
+      </w:r>
+      <w:r>
+        <w:rPr>
+          <w:rFonts w:ascii="Times New Roman" w:hAnsi="Times New Roman" w:eastAsia="Times New Roman" w:cs="Times New Roman"/>
+          <w:b w:val="0"/>
+          <w:i w:val="0"/>
+          <w:sz w:val="24"/>
+        </w:rPr>
+        <w:t xml:space="preserve"> and no NAT gateway, and deliberately ignores dynamic ones.</w:t>
+      </w:r>
+    </w:p>
+    <w:p>
+      <w:pPr>
+        <w:pStyle w:val="Heading3"/>
+      </w:pPr>
+      <w:r>
+        <w:rPr>
+          <w:rFonts w:ascii="Times New Roman" w:hAnsi="Times New Roman" w:eastAsia="Times New Roman" w:cs="Times New Roman"/>
+          <w:b/>
+          <w:i/>
+          <w:sz w:val="24"/>
+        </w:rPr>
+        <w:t>Module 5: Identity and access management</w:t>
+      </w:r>
+    </w:p>
+    <w:p>
+      <w:pPr>
+        <w:spacing w:before="0" w:after="120" w:line="360" w:lineRule="auto"/>
+        <w:jc w:val="both"/>
+      </w:pPr>
+      <w:r>
+        <w:rPr>
+          <w:rFonts w:ascii="Times New Roman" w:hAnsi="Times New Roman" w:eastAsia="Times New Roman" w:cs="Times New Roman"/>
+          <w:b/>
+          <w:i w:val="0"/>
+          <w:sz w:val="24"/>
+        </w:rPr>
+        <w:t>Concept.</w:t>
+      </w:r>
+      <w:r>
+        <w:rPr>
+          <w:rFonts w:ascii="Times New Roman" w:hAnsi="Times New Roman" w:eastAsia="Times New Roman" w:cs="Times New Roman"/>
+          <w:b w:val="0"/>
+          <w:i w:val="0"/>
+          <w:sz w:val="24"/>
+        </w:rPr>
+        <w:t xml:space="preserve"> Access to cloud resources is controlled by an identity provider (Microsoft Entra ID), identities (users, service principals, managed identities) and role-based access control (RBAC) that grants roles at a scope. The principle of least privilege says an identity should have only the roles it needs. OAuth 2.0 access tokens prove who is calling.</w:t>
+      </w:r>
+    </w:p>
+    <w:p>
+      <w:pPr>
+        <w:spacing w:before="0" w:after="120" w:line="360" w:lineRule="auto"/>
+        <w:jc w:val="both"/>
+      </w:pPr>
+      <w:r>
+        <w:rPr>
+          <w:rFonts w:ascii="Times New Roman" w:hAnsi="Times New Roman" w:eastAsia="Times New Roman" w:cs="Times New Roman"/>
+          <w:b/>
+          <w:i w:val="0"/>
+          <w:sz w:val="24"/>
+        </w:rPr>
+        <w:t>Applied in CloudPulse.</w:t>
+      </w:r>
+      <w:r>
+        <w:rPr>
+          <w:rFonts w:ascii="Times New Roman" w:hAnsi="Times New Roman" w:eastAsia="Times New Roman" w:cs="Times New Roman"/>
+          <w:b w:val="0"/>
+          <w:i w:val="0"/>
+          <w:sz w:val="24"/>
+        </w:rPr>
+        <w:t xml:space="preserve"> CloudPulse uses a service principal with only Reader and Cost Management Reader on one subscription, or a managed identity with no secret (Section 4.3). Its own users are separated by role: administrator, workspace owner and viewer.</w:t>
+      </w:r>
+    </w:p>
+    <w:p>
+      <w:pPr>
+        <w:pStyle w:val="Heading3"/>
+      </w:pPr>
+      <w:r>
+        <w:rPr>
+          <w:rFonts w:ascii="Times New Roman" w:hAnsi="Times New Roman" w:eastAsia="Times New Roman" w:cs="Times New Roman"/>
+          <w:b/>
+          <w:i/>
+          <w:sz w:val="24"/>
+        </w:rPr>
+        <w:t>Module 6: Resource management and governance</w:t>
+      </w:r>
+    </w:p>
+    <w:p>
+      <w:pPr>
+        <w:spacing w:before="0" w:after="120" w:line="360" w:lineRule="auto"/>
+        <w:jc w:val="both"/>
+      </w:pPr>
+      <w:r>
+        <w:rPr>
+          <w:rFonts w:ascii="Times New Roman" w:hAnsi="Times New Roman" w:eastAsia="Times New Roman" w:cs="Times New Roman"/>
+          <w:b/>
+          <w:i w:val="0"/>
+          <w:sz w:val="24"/>
+        </w:rPr>
+        <w:t>Concept.</w:t>
+      </w:r>
+      <w:r>
+        <w:rPr>
+          <w:rFonts w:ascii="Times New Roman" w:hAnsi="Times New Roman" w:eastAsia="Times New Roman" w:cs="Times New Roman"/>
+          <w:b w:val="0"/>
+          <w:i w:val="0"/>
+          <w:sz w:val="24"/>
+        </w:rPr>
+        <w:t xml:space="preserve"> Azure organises resources in tenants, subscriptions and resource groups under Azure Resource Manager (ARM). Tags attach metadata such as owner or team, and Azure Policy can restrict regions or require tags. Governance means being able to say who owns what and what it is for.</w:t>
+      </w:r>
+    </w:p>
+    <w:p>
+      <w:pPr>
+        <w:spacing w:before="0" w:after="120" w:line="360" w:lineRule="auto"/>
+        <w:jc w:val="both"/>
+      </w:pPr>
+      <w:r>
+        <w:rPr>
+          <w:rFonts w:ascii="Times New Roman" w:hAnsi="Times New Roman" w:eastAsia="Times New Roman" w:cs="Times New Roman"/>
+          <w:b/>
+          <w:i w:val="0"/>
+          <w:sz w:val="24"/>
+        </w:rPr>
+        <w:t>Applied in CloudPulse.</w:t>
+      </w:r>
+      <w:r>
+        <w:rPr>
+          <w:rFonts w:ascii="Times New Roman" w:hAnsi="Times New Roman" w:eastAsia="Times New Roman" w:cs="Times New Roman"/>
+          <w:b w:val="0"/>
+          <w:i w:val="0"/>
+          <w:sz w:val="24"/>
+        </w:rPr>
+        <w:t xml:space="preserve"> Resource Graph queries the whole inventory in one call; owner tags are a fallback for ownership attribution; untagged spend becomes a governance finding; the scripts read the subscription's allowed-location policy.</w:t>
+      </w:r>
+    </w:p>
+    <w:p>
+      <w:pPr>
+        <w:pStyle w:val="Heading3"/>
+      </w:pPr>
+      <w:r>
+        <w:rPr>
+          <w:rFonts w:ascii="Times New Roman" w:hAnsi="Times New Roman" w:eastAsia="Times New Roman" w:cs="Times New Roman"/>
+          <w:b/>
+          <w:i/>
+          <w:sz w:val="24"/>
+        </w:rPr>
+        <w:t>Module 7: Monitoring and observability</w:t>
+      </w:r>
+    </w:p>
+    <w:p>
+      <w:pPr>
+        <w:spacing w:before="0" w:after="120" w:line="360" w:lineRule="auto"/>
+        <w:jc w:val="both"/>
+      </w:pPr>
+      <w:r>
+        <w:rPr>
+          <w:rFonts w:ascii="Times New Roman" w:hAnsi="Times New Roman" w:eastAsia="Times New Roman" w:cs="Times New Roman"/>
+          <w:b/>
+          <w:i w:val="0"/>
+          <w:sz w:val="24"/>
+        </w:rPr>
+        <w:t>Concept.</w:t>
+      </w:r>
+      <w:r>
+        <w:rPr>
+          <w:rFonts w:ascii="Times New Roman" w:hAnsi="Times New Roman" w:eastAsia="Times New Roman" w:cs="Times New Roman"/>
+          <w:b w:val="0"/>
+          <w:i w:val="0"/>
+          <w:sz w:val="24"/>
+        </w:rPr>
+        <w:t xml:space="preserve"> Azure Monitor collects platform metrics (for a VM: Percentage CPU, Network In Total and Network Out Total) with hourly or finer granularity. The Activity Log records control-plane operations, who performed them and when, for 90 days. Azure Advisor turns telemetry into recommendations in five categories, one of which is cost.</w:t>
+      </w:r>
+    </w:p>
+    <w:p>
+      <w:pPr>
+        <w:spacing w:before="0" w:after="120" w:line="360" w:lineRule="auto"/>
+        <w:jc w:val="both"/>
+      </w:pPr>
+      <w:r>
+        <w:rPr>
+          <w:rFonts w:ascii="Times New Roman" w:hAnsi="Times New Roman" w:eastAsia="Times New Roman" w:cs="Times New Roman"/>
+          <w:b/>
+          <w:i w:val="0"/>
+          <w:sz w:val="24"/>
+        </w:rPr>
+        <w:t>Applied in CloudPulse.</w:t>
+      </w:r>
+      <w:r>
+        <w:rPr>
+          <w:rFonts w:ascii="Times New Roman" w:hAnsi="Times New Roman" w:eastAsia="Times New Roman" w:cs="Times New Roman"/>
+          <w:b w:val="0"/>
+          <w:i w:val="0"/>
+          <w:sz w:val="24"/>
+        </w:rPr>
+        <w:t xml:space="preserve"> Metrics feed the VM verdict, the Activity Log feeds the creator lookup in </w:t>
+      </w:r>
+      <w:r>
+        <w:rPr>
+          <w:rFonts w:ascii="Courier New" w:hAnsi="Courier New" w:eastAsia="Courier New" w:cs="Courier New"/>
+          <w:b w:val="0"/>
+          <w:i w:val="0"/>
+          <w:sz w:val="22"/>
+        </w:rPr>
+        <w:t>owners.py</w:t>
+      </w:r>
+      <w:r>
+        <w:rPr>
+          <w:rFonts w:ascii="Times New Roman" w:hAnsi="Times New Roman" w:eastAsia="Times New Roman" w:cs="Times New Roman"/>
+          <w:b w:val="0"/>
+          <w:i w:val="0"/>
+          <w:sz w:val="24"/>
+        </w:rPr>
+        <w:t xml:space="preserve"> and </w:t>
+      </w:r>
+      <w:r>
+        <w:rPr>
+          <w:rFonts w:ascii="Courier New" w:hAnsi="Courier New" w:eastAsia="Courier New" w:cs="Courier New"/>
+          <w:b w:val="0"/>
+          <w:i w:val="0"/>
+          <w:sz w:val="22"/>
+        </w:rPr>
+        <w:t>fetch_creator</w:t>
+      </w:r>
+      <w:r>
+        <w:rPr>
+          <w:rFonts w:ascii="Times New Roman" w:hAnsi="Times New Roman" w:eastAsia="Times New Roman" w:cs="Times New Roman"/>
+          <w:b w:val="0"/>
+          <w:i w:val="0"/>
+          <w:sz w:val="24"/>
+        </w:rPr>
+        <w:t>, and Advisor items are merged into findings as supporting evidence.</w:t>
+      </w:r>
+    </w:p>
+    <w:p>
+      <w:pPr>
+        <w:pStyle w:val="Heading3"/>
+      </w:pPr>
+      <w:r>
+        <w:rPr>
+          <w:rFonts w:ascii="Times New Roman" w:hAnsi="Times New Roman" w:eastAsia="Times New Roman" w:cs="Times New Roman"/>
+          <w:b/>
+          <w:i/>
+          <w:sz w:val="24"/>
+        </w:rPr>
+        <w:t>Module 8: Cloud economics and pricing models</w:t>
+      </w:r>
+    </w:p>
+    <w:p>
+      <w:pPr>
+        <w:spacing w:before="0" w:after="120" w:line="360" w:lineRule="auto"/>
+        <w:jc w:val="both"/>
+      </w:pPr>
+      <w:r>
+        <w:rPr>
+          <w:rFonts w:ascii="Times New Roman" w:hAnsi="Times New Roman" w:eastAsia="Times New Roman" w:cs="Times New Roman"/>
+          <w:b/>
+          <w:i w:val="0"/>
+          <w:sz w:val="24"/>
+        </w:rPr>
+        <w:t>Concept.</w:t>
+      </w:r>
+      <w:r>
+        <w:rPr>
+          <w:rFonts w:ascii="Times New Roman" w:hAnsi="Times New Roman" w:eastAsia="Times New Roman" w:cs="Times New Roman"/>
+          <w:b w:val="0"/>
+          <w:i w:val="0"/>
+          <w:sz w:val="24"/>
+        </w:rPr>
+        <w:t xml:space="preserve"> Compute can be bought pay-as-you-go, with one- or three-year reservations or savings plans at a discount, or as interruptible Spot capacity. Retail prices are published in a public price list. Usage is billed after it happens and Azure publishes cost data with a delay of several hours.</w:t>
+      </w:r>
+    </w:p>
+    <w:p>
+      <w:pPr>
+        <w:spacing w:before="0" w:after="120" w:line="360" w:lineRule="auto"/>
+        <w:jc w:val="both"/>
+      </w:pPr>
+      <w:r>
+        <w:rPr>
+          <w:rFonts w:ascii="Times New Roman" w:hAnsi="Times New Roman" w:eastAsia="Times New Roman" w:cs="Times New Roman"/>
+          <w:b/>
+          <w:i w:val="0"/>
+          <w:sz w:val="24"/>
+        </w:rPr>
+        <w:t>Applied in CloudPulse.</w:t>
+      </w:r>
+      <w:r>
+        <w:rPr>
+          <w:rFonts w:ascii="Times New Roman" w:hAnsi="Times New Roman" w:eastAsia="Times New Roman" w:cs="Times New Roman"/>
+          <w:b w:val="0"/>
+          <w:i w:val="0"/>
+          <w:sz w:val="24"/>
+        </w:rPr>
+        <w:t xml:space="preserve"> The price book reads the Retail Prices API with a cache and fallback tables, and cost data is back-filled for 90 days. The 8 to 24 hour delay is why verification waits for three billed days after a fix.</w:t>
+      </w:r>
+    </w:p>
+    <w:p>
+      <w:pPr>
+        <w:pStyle w:val="Heading3"/>
+      </w:pPr>
+      <w:r>
+        <w:rPr>
+          <w:rFonts w:ascii="Times New Roman" w:hAnsi="Times New Roman" w:eastAsia="Times New Roman" w:cs="Times New Roman"/>
+          <w:b/>
+          <w:i/>
+          <w:sz w:val="24"/>
+        </w:rPr>
+        <w:t>Module 9: FinOps</w:t>
+      </w:r>
+    </w:p>
+    <w:p>
+      <w:pPr>
+        <w:spacing w:before="0" w:after="120" w:line="360" w:lineRule="auto"/>
+        <w:jc w:val="both"/>
+      </w:pPr>
+      <w:r>
+        <w:rPr>
+          <w:rFonts w:ascii="Times New Roman" w:hAnsi="Times New Roman" w:eastAsia="Times New Roman" w:cs="Times New Roman"/>
+          <w:b/>
+          <w:i w:val="0"/>
+          <w:sz w:val="24"/>
+        </w:rPr>
+        <w:t>Concept.</w:t>
+      </w:r>
+      <w:r>
+        <w:rPr>
+          <w:rFonts w:ascii="Times New Roman" w:hAnsi="Times New Roman" w:eastAsia="Times New Roman" w:cs="Times New Roman"/>
+          <w:b w:val="0"/>
+          <w:i w:val="0"/>
+          <w:sz w:val="24"/>
+        </w:rPr>
+        <w:t xml:space="preserve"> FinOps is the practice of managing cloud cost through shared accountability. Its cycle is to inform (visibility and allocation), optimise (remove waste, rightsize, commit) and operate (govern continuously) [2], [20]. The Cost Optimization pillar of the Azure Well-Architected Framework expresses the same ideas.</w:t>
+      </w:r>
+    </w:p>
+    <w:p>
+      <w:pPr>
+        <w:spacing w:before="0" w:after="120" w:line="360" w:lineRule="auto"/>
+        <w:jc w:val="both"/>
+      </w:pPr>
+      <w:r>
+        <w:rPr>
+          <w:rFonts w:ascii="Times New Roman" w:hAnsi="Times New Roman" w:eastAsia="Times New Roman" w:cs="Times New Roman"/>
+          <w:b/>
+          <w:i w:val="0"/>
+          <w:sz w:val="24"/>
+        </w:rPr>
+        <w:t>Applied in CloudPulse.</w:t>
+      </w:r>
+      <w:r>
+        <w:rPr>
+          <w:rFonts w:ascii="Times New Roman" w:hAnsi="Times New Roman" w:eastAsia="Times New Roman" w:cs="Times New Roman"/>
+          <w:b w:val="0"/>
+          <w:i w:val="0"/>
+          <w:sz w:val="24"/>
+        </w:rPr>
+        <w:t xml:space="preserve"> The whole cost-to-action loop is an implementation of that cycle: the Overview and Cost explorer inform, findings and priority optimise, and the lifecycle with verification operates.</w:t>
+      </w:r>
+    </w:p>
+    <w:p>
+      <w:pPr>
+        <w:pStyle w:val="Heading3"/>
+      </w:pPr>
+      <w:r>
+        <w:rPr>
+          <w:rFonts w:ascii="Times New Roman" w:hAnsi="Times New Roman" w:eastAsia="Times New Roman" w:cs="Times New Roman"/>
+          <w:b/>
+          <w:i/>
+          <w:sz w:val="24"/>
+        </w:rPr>
+        <w:t>Module 10: Elasticity, scaling and cost</w:t>
+      </w:r>
+    </w:p>
+    <w:p>
+      <w:pPr>
+        <w:spacing w:before="0" w:after="120" w:line="360" w:lineRule="auto"/>
+        <w:jc w:val="both"/>
+      </w:pPr>
+      <w:r>
+        <w:rPr>
+          <w:rFonts w:ascii="Times New Roman" w:hAnsi="Times New Roman" w:eastAsia="Times New Roman" w:cs="Times New Roman"/>
+          <w:b/>
+          <w:i w:val="0"/>
+          <w:sz w:val="24"/>
+        </w:rPr>
+        <w:t>Concept.</w:t>
+      </w:r>
+      <w:r>
+        <w:rPr>
+          <w:rFonts w:ascii="Times New Roman" w:hAnsi="Times New Roman" w:eastAsia="Times New Roman" w:cs="Times New Roman"/>
+          <w:b w:val="0"/>
+          <w:i w:val="0"/>
+          <w:sz w:val="24"/>
+        </w:rPr>
+        <w:t xml:space="preserve"> Elasticity means capacity can be added or removed quickly, which is why a short mistake, such as leaving a larger size running, appears on the bill within a day. Autoscaling and scheduled shutdown are the usual controls.</w:t>
+      </w:r>
+    </w:p>
+    <w:p>
+      <w:pPr>
+        <w:spacing w:before="0" w:after="120" w:line="360" w:lineRule="auto"/>
+        <w:jc w:val="both"/>
+      </w:pPr>
+      <w:r>
+        <w:rPr>
+          <w:rFonts w:ascii="Times New Roman" w:hAnsi="Times New Roman" w:eastAsia="Times New Roman" w:cs="Times New Roman"/>
+          <w:b/>
+          <w:i w:val="0"/>
+          <w:sz w:val="24"/>
+        </w:rPr>
+        <w:t>Applied in CloudPulse.</w:t>
+      </w:r>
+      <w:r>
+        <w:rPr>
+          <w:rFonts w:ascii="Times New Roman" w:hAnsi="Times New Roman" w:eastAsia="Times New Roman" w:cs="Times New Roman"/>
+          <w:b w:val="0"/>
+          <w:i w:val="0"/>
+          <w:sz w:val="24"/>
+        </w:rPr>
+        <w:t xml:space="preserve"> </w:t>
+      </w:r>
+      <w:r>
+        <w:rPr>
+          <w:rFonts w:ascii="Courier New" w:hAnsi="Courier New" w:eastAsia="Courier New" w:cs="Courier New"/>
+          <w:b w:val="0"/>
+          <w:i w:val="0"/>
+          <w:sz w:val="22"/>
+        </w:rPr>
+        <w:t>05-spike.sh up</w:t>
+      </w:r>
+      <w:r>
+        <w:rPr>
+          <w:rFonts w:ascii="Times New Roman" w:hAnsi="Times New Roman" w:eastAsia="Times New Roman" w:cs="Times New Roman"/>
+          <w:b w:val="0"/>
+          <w:i w:val="0"/>
+          <w:sz w:val="24"/>
+        </w:rPr>
+        <w:t xml:space="preserve"> scales the test workload for a day to create a real cost spike that the anomaly detector must flag, and </w:t>
+      </w:r>
+      <w:r>
+        <w:rPr>
+          <w:rFonts w:ascii="Courier New" w:hAnsi="Courier New" w:eastAsia="Courier New" w:cs="Courier New"/>
+          <w:b w:val="0"/>
+          <w:i w:val="0"/>
+          <w:sz w:val="22"/>
+        </w:rPr>
+        <w:t>down</w:t>
+      </w:r>
+      <w:r>
+        <w:rPr>
+          <w:rFonts w:ascii="Times New Roman" w:hAnsi="Times New Roman" w:eastAsia="Times New Roman" w:cs="Times New Roman"/>
+          <w:b w:val="0"/>
+          <w:i w:val="0"/>
+          <w:sz w:val="24"/>
+        </w:rPr>
+        <w:t xml:space="preserve"> reverses it.</w:t>
+      </w:r>
+    </w:p>
+    <w:p>
+      <w:pPr>
+        <w:pStyle w:val="Heading3"/>
+      </w:pPr>
+      <w:r>
+        <w:rPr>
+          <w:rFonts w:ascii="Times New Roman" w:hAnsi="Times New Roman" w:eastAsia="Times New Roman" w:cs="Times New Roman"/>
+          <w:b/>
+          <w:i/>
+          <w:sz w:val="24"/>
+        </w:rPr>
+        <w:t>Module 11: Security and the shared responsibility model</w:t>
+      </w:r>
+    </w:p>
+    <w:p>
+      <w:pPr>
+        <w:spacing w:before="0" w:after="120" w:line="360" w:lineRule="auto"/>
+        <w:jc w:val="both"/>
+      </w:pPr>
+      <w:r>
+        <w:rPr>
+          <w:rFonts w:ascii="Times New Roman" w:hAnsi="Times New Roman" w:eastAsia="Times New Roman" w:cs="Times New Roman"/>
+          <w:b/>
+          <w:i w:val="0"/>
+          <w:sz w:val="24"/>
+        </w:rPr>
+        <w:t>Concept.</w:t>
+      </w:r>
+      <w:r>
+        <w:rPr>
+          <w:rFonts w:ascii="Times New Roman" w:hAnsi="Times New Roman" w:eastAsia="Times New Roman" w:cs="Times New Roman"/>
+          <w:b w:val="0"/>
+          <w:i w:val="0"/>
+          <w:sz w:val="24"/>
+        </w:rPr>
+        <w:t xml:space="preserve"> The provider secures the infrastructure; the customer secures its identities, data and configuration. Practical controls include encryption at rest, secret management, hashed passwords, rate limiting and read-only access.</w:t>
+      </w:r>
+    </w:p>
+    <w:p>
+      <w:pPr>
+        <w:spacing w:before="0" w:after="120" w:line="360" w:lineRule="auto"/>
+        <w:jc w:val="both"/>
+      </w:pPr>
+      <w:r>
+        <w:rPr>
+          <w:rFonts w:ascii="Times New Roman" w:hAnsi="Times New Roman" w:eastAsia="Times New Roman" w:cs="Times New Roman"/>
+          <w:b/>
+          <w:i w:val="0"/>
+          <w:sz w:val="24"/>
+        </w:rPr>
+        <w:t>Applied in CloudPulse.</w:t>
+      </w:r>
+      <w:r>
+        <w:rPr>
+          <w:rFonts w:ascii="Times New Roman" w:hAnsi="Times New Roman" w:eastAsia="Times New Roman" w:cs="Times New Roman"/>
+          <w:b w:val="0"/>
+          <w:i w:val="0"/>
+          <w:sz w:val="24"/>
+        </w:rPr>
+        <w:t xml:space="preserve"> Stored cloud secrets use Fernet encryption, passwords use scrypt, sessions are server-side, and the collector issues only read requests (Table 4.4).</w:t>
+      </w:r>
+    </w:p>
+    <w:p>
+      <w:pPr>
+        <w:pStyle w:val="Heading3"/>
+      </w:pPr>
+      <w:r>
+        <w:rPr>
+          <w:rFonts w:ascii="Times New Roman" w:hAnsi="Times New Roman" w:eastAsia="Times New Roman" w:cs="Times New Roman"/>
+          <w:b/>
+          <w:i/>
+          <w:sz w:val="24"/>
+        </w:rPr>
+        <w:t>Module 12: Automation, containers and DevOps</w:t>
+      </w:r>
+    </w:p>
+    <w:p>
+      <w:pPr>
+        <w:spacing w:before="0" w:after="120" w:line="360" w:lineRule="auto"/>
+        <w:jc w:val="both"/>
+      </w:pPr>
+      <w:r>
+        <w:rPr>
+          <w:rFonts w:ascii="Times New Roman" w:hAnsi="Times New Roman" w:eastAsia="Times New Roman" w:cs="Times New Roman"/>
+          <w:b/>
+          <w:i w:val="0"/>
+          <w:sz w:val="24"/>
+        </w:rPr>
+        <w:t>Concept.</w:t>
+      </w:r>
+      <w:r>
+        <w:rPr>
+          <w:rFonts w:ascii="Times New Roman" w:hAnsi="Times New Roman" w:eastAsia="Times New Roman" w:cs="Times New Roman"/>
+          <w:b w:val="0"/>
+          <w:i w:val="0"/>
+          <w:sz w:val="24"/>
+        </w:rPr>
+        <w:t xml:space="preserve"> Cloud resources are created repeatably with the command-line interface or infrastructure-as-code tools (ARM templates, Bicep, Terraform). Containers package an application with its dependencies, and continuous integration runs tests on every change.</w:t>
+      </w:r>
+    </w:p>
+    <w:p>
+      <w:pPr>
+        <w:spacing w:before="0" w:after="120" w:line="360" w:lineRule="auto"/>
+        <w:jc w:val="both"/>
+      </w:pPr>
+      <w:r>
+        <w:rPr>
+          <w:rFonts w:ascii="Times New Roman" w:hAnsi="Times New Roman" w:eastAsia="Times New Roman" w:cs="Times New Roman"/>
+          <w:b/>
+          <w:i w:val="0"/>
+          <w:sz w:val="24"/>
+        </w:rPr>
+        <w:t>Applied in CloudPulse.</w:t>
+      </w:r>
+      <w:r>
+        <w:rPr>
+          <w:rFonts w:ascii="Times New Roman" w:hAnsi="Times New Roman" w:eastAsia="Times New Roman" w:cs="Times New Roman"/>
+          <w:b w:val="0"/>
+          <w:i w:val="0"/>
+          <w:sz w:val="24"/>
+        </w:rPr>
+        <w:t xml:space="preserve"> The Azure scripts use the CLI, the Dockerfile and </w:t>
+      </w:r>
+      <w:r>
+        <w:rPr>
+          <w:rFonts w:ascii="Courier New" w:hAnsi="Courier New" w:eastAsia="Courier New" w:cs="Courier New"/>
+          <w:b w:val="0"/>
+          <w:i w:val="0"/>
+          <w:sz w:val="22"/>
+        </w:rPr>
+        <w:t>docker-compose.yml</w:t>
+      </w:r>
+      <w:r>
+        <w:rPr>
+          <w:rFonts w:ascii="Times New Roman" w:hAnsi="Times New Roman" w:eastAsia="Times New Roman" w:cs="Times New Roman"/>
+          <w:b w:val="0"/>
+          <w:i w:val="0"/>
+          <w:sz w:val="24"/>
+        </w:rPr>
+        <w:t xml:space="preserve"> package the application, </w:t>
+      </w:r>
+      <w:r>
+        <w:rPr>
+          <w:rFonts w:ascii="Courier New" w:hAnsi="Courier New" w:eastAsia="Courier New" w:cs="Courier New"/>
+          <w:b w:val="0"/>
+          <w:i w:val="0"/>
+          <w:sz w:val="22"/>
+        </w:rPr>
+        <w:t>render.yaml</w:t>
+      </w:r>
+      <w:r>
+        <w:rPr>
+          <w:rFonts w:ascii="Times New Roman" w:hAnsi="Times New Roman" w:eastAsia="Times New Roman" w:cs="Times New Roman"/>
+          <w:b w:val="0"/>
+          <w:i w:val="0"/>
+          <w:sz w:val="24"/>
+        </w:rPr>
+        <w:t xml:space="preserve"> and </w:t>
+      </w:r>
+      <w:r>
+        <w:rPr>
+          <w:rFonts w:ascii="Courier New" w:hAnsi="Courier New" w:eastAsia="Courier New" w:cs="Courier New"/>
+          <w:b w:val="0"/>
+          <w:i w:val="0"/>
+          <w:sz w:val="22"/>
+        </w:rPr>
+        <w:t>04-deploy-app.sh</w:t>
+      </w:r>
+      <w:r>
+        <w:rPr>
+          <w:rFonts w:ascii="Times New Roman" w:hAnsi="Times New Roman" w:eastAsia="Times New Roman" w:cs="Times New Roman"/>
+          <w:b w:val="0"/>
+          <w:i w:val="0"/>
+          <w:sz w:val="24"/>
+        </w:rPr>
+        <w:t xml:space="preserve"> deploy it, and GitHub Actions runs the 27 tests.</w:t>
+      </w:r>
+    </w:p>
+    <w:p>
+      <w:pPr>
+        <w:keepNext/>
+        <w:spacing w:before="120" w:after="80" w:line="240" w:lineRule="auto"/>
+        <w:jc w:val="center"/>
+      </w:pPr>
+      <w:r>
+        <w:rPr>
+          <w:rFonts w:ascii="Times New Roman" w:hAnsi="Times New Roman" w:eastAsia="Times New Roman" w:cs="Times New Roman"/>
+          <w:b/>
+          <w:i w:val="0"/>
+          <w:sz w:val="22"/>
+        </w:rPr>
+        <w:t>Table 3.4: Cloud computing modules and where CloudPulse applies them</w:t>
+      </w:r>
+    </w:p>
+    <w:tbl>
+      <w:tblPr>
+        <w:tblStyle w:val="TableGrid"/>
+        <w:jc w:val="center"/>
+        <w:tblLook w:firstColumn="1" w:firstRow="1" w:lastColumn="0" w:lastRow="0" w:noHBand="0" w:noVBand="1" w:val="04A0"/>
+        <w:tblLayout w:type="fixed"/>
+        <w:tblW w:w="8505" w:type="dxa"/>
+      </w:tblPr>
+      <w:tblGrid>
+        <w:gridCol w:w="907"/>
+        <w:gridCol w:w="3061"/>
+        <w:gridCol w:w="4536"/>
+      </w:tblGrid>
+      <w:tr>
+        <w:trPr>
+          <w:tblHeader w:val="true"/>
+          <w:cantSplit w:val="true"/>
+        </w:trPr>
+        <w:tc>
+          <w:tcPr>
+            <w:tcW w:type="dxa" w:w="907"/>
+            <w:shd w:val="clear" w:color="auto" w:fill="D9D9D9"/>
+          </w:tcPr>
+          <w:p>
+            <w:pPr>
+              <w:keepNext/>
+              <w:spacing w:line="240" w:lineRule="auto" w:after="40"/>
+              <w:jc w:val="center"/>
+            </w:pPr>
+            <w:r/>
+            <w:r>
+              <w:rPr>
+                <w:rFonts w:ascii="Times New Roman" w:hAnsi="Times New Roman" w:eastAsia="Times New Roman" w:cs="Times New Roman"/>
+                <w:b/>
+                <w:i w:val="0"/>
+                <w:sz w:val="20"/>
+              </w:rPr>
+              <w:t>Module</w:t>
+            </w:r>
+          </w:p>
+        </w:tc>
+        <w:tc>
+          <w:tcPr>
+            <w:tcW w:type="dxa" w:w="3061"/>
+            <w:shd w:val="clear" w:color="auto" w:fill="D9D9D9"/>
+          </w:tcPr>
+          <w:p>
+            <w:pPr>
+              <w:keepNext/>
+              <w:spacing w:line="240" w:lineRule="auto" w:after="40"/>
+              <w:jc w:val="center"/>
+            </w:pPr>
+            <w:r/>
+            <w:r>
+              <w:rPr>
+                <w:rFonts w:ascii="Times New Roman" w:hAnsi="Times New Roman" w:eastAsia="Times New Roman" w:cs="Times New Roman"/>
+                <w:b/>
+                <w:i w:val="0"/>
+                <w:sz w:val="20"/>
+              </w:rPr>
+              <w:t>Concept</w:t>
+            </w:r>
+          </w:p>
+        </w:tc>
+        <w:tc>
+          <w:tcPr>
+            <w:tcW w:type="dxa" w:w="4535"/>
+            <w:shd w:val="clear" w:color="auto" w:fill="D9D9D9"/>
+          </w:tcPr>
+          <w:p>
+            <w:pPr>
+              <w:keepNext/>
+              <w:spacing w:line="240" w:lineRule="auto" w:after="40"/>
+              <w:jc w:val="center"/>
+            </w:pPr>
+            <w:r/>
+            <w:r>
+              <w:rPr>
+                <w:rFonts w:ascii="Times New Roman" w:hAnsi="Times New Roman" w:eastAsia="Times New Roman" w:cs="Times New Roman"/>
+                <w:b/>
+                <w:i w:val="0"/>
+                <w:sz w:val="20"/>
+              </w:rPr>
+              <w:t>Where in CloudPulse</w:t>
+            </w:r>
+          </w:p>
+        </w:tc>
+      </w:tr>
+      <w:tr>
+        <w:trPr>
+          <w:cantSplit w:val="true"/>
+        </w:trPr>
+        <w:tc>
+          <w:tcPr>
+            <w:tcW w:type="dxa" w:w="907"/>
+          </w:tcPr>
+          <w:p>
+            <w:pPr>
+              <w:keepNext/>
+              <w:spacing w:line="240" w:lineRule="auto" w:after="40"/>
+              <w:jc w:val="left"/>
+            </w:pPr>
+            <w:r/>
+            <w:r>
+              <w:rPr>
+                <w:rFonts w:ascii="Times New Roman" w:hAnsi="Times New Roman" w:eastAsia="Times New Roman" w:cs="Times New Roman"/>
+                <w:b w:val="0"/>
+                <w:i w:val="0"/>
+                <w:sz w:val="20"/>
+              </w:rPr>
+              <w:t>1</w:t>
+            </w:r>
+          </w:p>
+        </w:tc>
+        <w:tc>
+          <w:tcPr>
+            <w:tcW w:type="dxa" w:w="3061"/>
+          </w:tcPr>
+          <w:p>
+            <w:pPr>
+              <w:keepNext/>
+              <w:spacing w:line="240" w:lineRule="auto" w:after="40"/>
+              <w:jc w:val="left"/>
+            </w:pPr>
+            <w:r/>
+            <w:r>
+              <w:rPr>
+                <w:rFonts w:ascii="Times New Roman" w:hAnsi="Times New Roman" w:eastAsia="Times New Roman" w:cs="Times New Roman"/>
+                <w:b w:val="0"/>
+                <w:i w:val="0"/>
+                <w:sz w:val="20"/>
+              </w:rPr>
+              <w:t>Service and deployment models</w:t>
+            </w:r>
+          </w:p>
+        </w:tc>
+        <w:tc>
+          <w:tcPr>
+            <w:tcW w:type="dxa" w:w="4535"/>
+          </w:tcPr>
+          <w:p>
+            <w:pPr>
+              <w:keepNext/>
+              <w:spacing w:line="240" w:lineRule="auto" w:after="40"/>
+              <w:jc w:val="left"/>
+            </w:pPr>
+            <w:r/>
+            <w:r>
+              <w:rPr>
+                <w:rFonts w:ascii="Times New Roman" w:hAnsi="Times New Roman" w:eastAsia="Times New Roman" w:cs="Times New Roman"/>
+                <w:b w:val="0"/>
+                <w:i w:val="0"/>
+                <w:sz w:val="20"/>
+              </w:rPr>
+              <w:t>IaaS monitored; PaaS and SaaS delivery</w:t>
+            </w:r>
+          </w:p>
+        </w:tc>
+      </w:tr>
+      <w:tr>
+        <w:trPr>
+          <w:cantSplit w:val="true"/>
+        </w:trPr>
+        <w:tc>
+          <w:tcPr>
+            <w:tcW w:type="dxa" w:w="907"/>
+          </w:tcPr>
+          <w:p>
+            <w:pPr>
+              <w:keepNext/>
+              <w:spacing w:line="240" w:lineRule="auto" w:after="40"/>
+              <w:jc w:val="left"/>
+            </w:pPr>
+            <w:r/>
+            <w:r>
+              <w:rPr>
+                <w:rFonts w:ascii="Times New Roman" w:hAnsi="Times New Roman" w:eastAsia="Times New Roman" w:cs="Times New Roman"/>
+                <w:b w:val="0"/>
+                <w:i w:val="0"/>
+                <w:sz w:val="20"/>
+              </w:rPr>
+              <w:t>2</w:t>
+            </w:r>
+          </w:p>
+        </w:tc>
+        <w:tc>
+          <w:tcPr>
+            <w:tcW w:type="dxa" w:w="3061"/>
+          </w:tcPr>
+          <w:p>
+            <w:pPr>
+              <w:keepNext/>
+              <w:spacing w:line="240" w:lineRule="auto" w:after="40"/>
+              <w:jc w:val="left"/>
+            </w:pPr>
+            <w:r/>
+            <w:r>
+              <w:rPr>
+                <w:rFonts w:ascii="Times New Roman" w:hAnsi="Times New Roman" w:eastAsia="Times New Roman" w:cs="Times New Roman"/>
+                <w:b w:val="0"/>
+                <w:i w:val="0"/>
+                <w:sz w:val="20"/>
+              </w:rPr>
+              <w:t>Virtualisation and compute</w:t>
+            </w:r>
+          </w:p>
+        </w:tc>
+        <w:tc>
+          <w:tcPr>
+            <w:tcW w:type="dxa" w:w="4535"/>
+          </w:tcPr>
+          <w:p>
+            <w:pPr>
+              <w:keepNext/>
+              <w:spacing w:line="240" w:lineRule="auto" w:after="40"/>
+              <w:jc w:val="left"/>
+            </w:pPr>
+            <w:r/>
+            <w:r>
+              <w:rPr>
+                <w:rFonts w:ascii="Times New Roman" w:hAnsi="Times New Roman" w:eastAsia="Times New Roman" w:cs="Times New Roman"/>
+                <w:b w:val="0"/>
+                <w:i w:val="0"/>
+                <w:sz w:val="20"/>
+              </w:rPr>
+              <w:t>stopped vs deallocated VMs; idle and oversized verdict</w:t>
+            </w:r>
+          </w:p>
+        </w:tc>
+      </w:tr>
+      <w:tr>
+        <w:trPr>
+          <w:cantSplit w:val="true"/>
+        </w:trPr>
+        <w:tc>
+          <w:tcPr>
+            <w:tcW w:type="dxa" w:w="907"/>
+          </w:tcPr>
+          <w:p>
+            <w:pPr>
+              <w:keepNext/>
+              <w:spacing w:line="240" w:lineRule="auto" w:after="40"/>
+              <w:jc w:val="left"/>
+            </w:pPr>
+            <w:r/>
+            <w:r>
+              <w:rPr>
+                <w:rFonts w:ascii="Times New Roman" w:hAnsi="Times New Roman" w:eastAsia="Times New Roman" w:cs="Times New Roman"/>
+                <w:b w:val="0"/>
+                <w:i w:val="0"/>
+                <w:sz w:val="20"/>
+              </w:rPr>
+              <w:t>3</w:t>
+            </w:r>
+          </w:p>
+        </w:tc>
+        <w:tc>
+          <w:tcPr>
+            <w:tcW w:type="dxa" w:w="3061"/>
+          </w:tcPr>
+          <w:p>
+            <w:pPr>
+              <w:keepNext/>
+              <w:spacing w:line="240" w:lineRule="auto" w:after="40"/>
+              <w:jc w:val="left"/>
+            </w:pPr>
+            <w:r/>
+            <w:r>
+              <w:rPr>
+                <w:rFonts w:ascii="Times New Roman" w:hAnsi="Times New Roman" w:eastAsia="Times New Roman" w:cs="Times New Roman"/>
+                <w:b w:val="0"/>
+                <w:i w:val="0"/>
+                <w:sz w:val="20"/>
+              </w:rPr>
+              <w:t>Cloud storage</w:t>
+            </w:r>
+          </w:p>
+        </w:tc>
+        <w:tc>
+          <w:tcPr>
+            <w:tcW w:type="dxa" w:w="4535"/>
+          </w:tcPr>
+          <w:p>
+            <w:pPr>
+              <w:keepNext/>
+              <w:spacing w:line="240" w:lineRule="auto" w:after="40"/>
+              <w:jc w:val="left"/>
+            </w:pPr>
+            <w:r/>
+            <w:r>
+              <w:rPr>
+                <w:rFonts w:ascii="Times New Roman" w:hAnsi="Times New Roman" w:eastAsia="Times New Roman" w:cs="Times New Roman"/>
+                <w:b w:val="0"/>
+                <w:i w:val="0"/>
+                <w:sz w:val="20"/>
+              </w:rPr>
+              <w:t>unattached disks; orphaned snapshots</w:t>
+            </w:r>
+          </w:p>
+        </w:tc>
+      </w:tr>
+      <w:tr>
+        <w:trPr>
+          <w:cantSplit w:val="true"/>
+        </w:trPr>
+        <w:tc>
+          <w:tcPr>
+            <w:tcW w:type="dxa" w:w="907"/>
+          </w:tcPr>
+          <w:p>
+            <w:pPr>
+              <w:keepNext/>
+              <w:spacing w:line="240" w:lineRule="auto" w:after="40"/>
+              <w:jc w:val="left"/>
+            </w:pPr>
+            <w:r/>
+            <w:r>
+              <w:rPr>
+                <w:rFonts w:ascii="Times New Roman" w:hAnsi="Times New Roman" w:eastAsia="Times New Roman" w:cs="Times New Roman"/>
+                <w:b w:val="0"/>
+                <w:i w:val="0"/>
+                <w:sz w:val="20"/>
+              </w:rPr>
+              <w:t>4</w:t>
+            </w:r>
+          </w:p>
+        </w:tc>
+        <w:tc>
+          <w:tcPr>
+            <w:tcW w:type="dxa" w:w="3061"/>
+          </w:tcPr>
+          <w:p>
+            <w:pPr>
+              <w:keepNext/>
+              <w:spacing w:line="240" w:lineRule="auto" w:after="40"/>
+              <w:jc w:val="left"/>
+            </w:pPr>
+            <w:r/>
+            <w:r>
+              <w:rPr>
+                <w:rFonts w:ascii="Times New Roman" w:hAnsi="Times New Roman" w:eastAsia="Times New Roman" w:cs="Times New Roman"/>
+                <w:b w:val="0"/>
+                <w:i w:val="0"/>
+                <w:sz w:val="20"/>
+              </w:rPr>
+              <w:t>Cloud networking</w:t>
+            </w:r>
+          </w:p>
+        </w:tc>
+        <w:tc>
+          <w:tcPr>
+            <w:tcW w:type="dxa" w:w="4535"/>
+          </w:tcPr>
+          <w:p>
+            <w:pPr>
+              <w:keepNext/>
+              <w:spacing w:line="240" w:lineRule="auto" w:after="40"/>
+              <w:jc w:val="left"/>
+            </w:pPr>
+            <w:r/>
+            <w:r>
+              <w:rPr>
+                <w:rFonts w:ascii="Times New Roman" w:hAnsi="Times New Roman" w:eastAsia="Times New Roman" w:cs="Times New Roman"/>
+                <w:b w:val="0"/>
+                <w:i w:val="0"/>
+                <w:sz w:val="20"/>
+              </w:rPr>
+              <w:t>idle static public IPs</w:t>
+            </w:r>
+          </w:p>
+        </w:tc>
+      </w:tr>
+      <w:tr>
+        <w:trPr>
+          <w:cantSplit w:val="true"/>
+        </w:trPr>
+        <w:tc>
+          <w:tcPr>
+            <w:tcW w:type="dxa" w:w="907"/>
+          </w:tcPr>
+          <w:p>
+            <w:pPr>
+              <w:keepNext/>
+              <w:spacing w:line="240" w:lineRule="auto" w:after="40"/>
+              <w:jc w:val="left"/>
+            </w:pPr>
+            <w:r/>
+            <w:r>
+              <w:rPr>
+                <w:rFonts w:ascii="Times New Roman" w:hAnsi="Times New Roman" w:eastAsia="Times New Roman" w:cs="Times New Roman"/>
+                <w:b w:val="0"/>
+                <w:i w:val="0"/>
+                <w:sz w:val="20"/>
+              </w:rPr>
+              <w:t>5</w:t>
+            </w:r>
+          </w:p>
+        </w:tc>
+        <w:tc>
+          <w:tcPr>
+            <w:tcW w:type="dxa" w:w="3061"/>
+          </w:tcPr>
+          <w:p>
+            <w:pPr>
+              <w:keepNext/>
+              <w:spacing w:line="240" w:lineRule="auto" w:after="40"/>
+              <w:jc w:val="left"/>
+            </w:pPr>
+            <w:r/>
+            <w:r>
+              <w:rPr>
+                <w:rFonts w:ascii="Times New Roman" w:hAnsi="Times New Roman" w:eastAsia="Times New Roman" w:cs="Times New Roman"/>
+                <w:b w:val="0"/>
+                <w:i w:val="0"/>
+                <w:sz w:val="20"/>
+              </w:rPr>
+              <w:t>Identity and access management</w:t>
+            </w:r>
+          </w:p>
+        </w:tc>
+        <w:tc>
+          <w:tcPr>
+            <w:tcW w:type="dxa" w:w="4535"/>
+          </w:tcPr>
+          <w:p>
+            <w:pPr>
+              <w:keepNext/>
+              <w:spacing w:line="240" w:lineRule="auto" w:after="40"/>
+              <w:jc w:val="left"/>
+            </w:pPr>
+            <w:r/>
+            <w:r>
+              <w:rPr>
+                <w:rFonts w:ascii="Times New Roman" w:hAnsi="Times New Roman" w:eastAsia="Times New Roman" w:cs="Times New Roman"/>
+                <w:b w:val="0"/>
+                <w:i w:val="0"/>
+                <w:sz w:val="20"/>
+              </w:rPr>
+              <w:t>service principal, RBAC, managed identity, token flow</w:t>
+            </w:r>
+          </w:p>
+        </w:tc>
+      </w:tr>
+      <w:tr>
+        <w:trPr>
+          <w:cantSplit w:val="true"/>
+        </w:trPr>
+        <w:tc>
+          <w:tcPr>
+            <w:tcW w:type="dxa" w:w="907"/>
+          </w:tcPr>
+          <w:p>
+            <w:pPr>
+              <w:keepNext/>
+              <w:spacing w:line="240" w:lineRule="auto" w:after="40"/>
+              <w:jc w:val="left"/>
+            </w:pPr>
+            <w:r/>
+            <w:r>
+              <w:rPr>
+                <w:rFonts w:ascii="Times New Roman" w:hAnsi="Times New Roman" w:eastAsia="Times New Roman" w:cs="Times New Roman"/>
+                <w:b w:val="0"/>
+                <w:i w:val="0"/>
+                <w:sz w:val="20"/>
+              </w:rPr>
+              <w:t>6</w:t>
+            </w:r>
+          </w:p>
+        </w:tc>
+        <w:tc>
+          <w:tcPr>
+            <w:tcW w:type="dxa" w:w="3061"/>
+          </w:tcPr>
+          <w:p>
+            <w:pPr>
+              <w:keepNext/>
+              <w:spacing w:line="240" w:lineRule="auto" w:after="40"/>
+              <w:jc w:val="left"/>
+            </w:pPr>
+            <w:r/>
+            <w:r>
+              <w:rPr>
+                <w:rFonts w:ascii="Times New Roman" w:hAnsi="Times New Roman" w:eastAsia="Times New Roman" w:cs="Times New Roman"/>
+                <w:b w:val="0"/>
+                <w:i w:val="0"/>
+                <w:sz w:val="20"/>
+              </w:rPr>
+              <w:t>Resource management and governance</w:t>
+            </w:r>
+          </w:p>
+        </w:tc>
+        <w:tc>
+          <w:tcPr>
+            <w:tcW w:type="dxa" w:w="4535"/>
+          </w:tcPr>
+          <w:p>
+            <w:pPr>
+              <w:keepNext/>
+              <w:spacing w:line="240" w:lineRule="auto" w:after="40"/>
+              <w:jc w:val="left"/>
+            </w:pPr>
+            <w:r/>
+            <w:r>
+              <w:rPr>
+                <w:rFonts w:ascii="Times New Roman" w:hAnsi="Times New Roman" w:eastAsia="Times New Roman" w:cs="Times New Roman"/>
+                <w:b w:val="0"/>
+                <w:i w:val="0"/>
+                <w:sz w:val="20"/>
+              </w:rPr>
+              <w:t>Resource Graph, tags, untagged-spend finding</w:t>
+            </w:r>
+          </w:p>
+        </w:tc>
+      </w:tr>
+      <w:tr>
+        <w:trPr>
+          <w:cantSplit w:val="true"/>
+        </w:trPr>
+        <w:tc>
+          <w:tcPr>
+            <w:tcW w:type="dxa" w:w="907"/>
+          </w:tcPr>
+          <w:p>
+            <w:pPr>
+              <w:keepNext/>
+              <w:spacing w:line="240" w:lineRule="auto" w:after="40"/>
+              <w:jc w:val="left"/>
+            </w:pPr>
+            <w:r/>
+            <w:r>
+              <w:rPr>
+                <w:rFonts w:ascii="Times New Roman" w:hAnsi="Times New Roman" w:eastAsia="Times New Roman" w:cs="Times New Roman"/>
+                <w:b w:val="0"/>
+                <w:i w:val="0"/>
+                <w:sz w:val="20"/>
+              </w:rPr>
+              <w:t>7</w:t>
+            </w:r>
+          </w:p>
+        </w:tc>
+        <w:tc>
+          <w:tcPr>
+            <w:tcW w:type="dxa" w:w="3061"/>
+          </w:tcPr>
+          <w:p>
+            <w:pPr>
+              <w:keepNext/>
+              <w:spacing w:line="240" w:lineRule="auto" w:after="40"/>
+              <w:jc w:val="left"/>
+            </w:pPr>
+            <w:r/>
+            <w:r>
+              <w:rPr>
+                <w:rFonts w:ascii="Times New Roman" w:hAnsi="Times New Roman" w:eastAsia="Times New Roman" w:cs="Times New Roman"/>
+                <w:b w:val="0"/>
+                <w:i w:val="0"/>
+                <w:sz w:val="20"/>
+              </w:rPr>
+              <w:t>Monitoring and observability</w:t>
+            </w:r>
+          </w:p>
+        </w:tc>
+        <w:tc>
+          <w:tcPr>
+            <w:tcW w:type="dxa" w:w="4535"/>
+          </w:tcPr>
+          <w:p>
+            <w:pPr>
+              <w:keepNext/>
+              <w:spacing w:line="240" w:lineRule="auto" w:after="40"/>
+              <w:jc w:val="left"/>
+            </w:pPr>
+            <w:r/>
+            <w:r>
+              <w:rPr>
+                <w:rFonts w:ascii="Times New Roman" w:hAnsi="Times New Roman" w:eastAsia="Times New Roman" w:cs="Times New Roman"/>
+                <w:b w:val="0"/>
+                <w:i w:val="0"/>
+                <w:sz w:val="20"/>
+              </w:rPr>
+              <w:t>Azure Monitor, Activity Log, Advisor</w:t>
+            </w:r>
+          </w:p>
+        </w:tc>
+      </w:tr>
+      <w:tr>
+        <w:trPr>
+          <w:cantSplit w:val="true"/>
+        </w:trPr>
+        <w:tc>
+          <w:tcPr>
+            <w:tcW w:type="dxa" w:w="907"/>
+          </w:tcPr>
+          <w:p>
+            <w:pPr>
+              <w:keepNext/>
+              <w:spacing w:line="240" w:lineRule="auto" w:after="40"/>
+              <w:jc w:val="left"/>
+            </w:pPr>
+            <w:r/>
+            <w:r>
+              <w:rPr>
+                <w:rFonts w:ascii="Times New Roman" w:hAnsi="Times New Roman" w:eastAsia="Times New Roman" w:cs="Times New Roman"/>
+                <w:b w:val="0"/>
+                <w:i w:val="0"/>
+                <w:sz w:val="20"/>
+              </w:rPr>
+              <w:t>8</w:t>
+            </w:r>
+          </w:p>
+        </w:tc>
+        <w:tc>
+          <w:tcPr>
+            <w:tcW w:type="dxa" w:w="3061"/>
+          </w:tcPr>
+          <w:p>
+            <w:pPr>
+              <w:keepNext/>
+              <w:spacing w:line="240" w:lineRule="auto" w:after="40"/>
+              <w:jc w:val="left"/>
+            </w:pPr>
+            <w:r/>
+            <w:r>
+              <w:rPr>
+                <w:rFonts w:ascii="Times New Roman" w:hAnsi="Times New Roman" w:eastAsia="Times New Roman" w:cs="Times New Roman"/>
+                <w:b w:val="0"/>
+                <w:i w:val="0"/>
+                <w:sz w:val="20"/>
+              </w:rPr>
+              <w:t>Cloud economics and pricing</w:t>
+            </w:r>
+          </w:p>
+        </w:tc>
+        <w:tc>
+          <w:tcPr>
+            <w:tcW w:type="dxa" w:w="4535"/>
+          </w:tcPr>
+          <w:p>
+            <w:pPr>
+              <w:keepNext/>
+              <w:spacing w:line="240" w:lineRule="auto" w:after="40"/>
+              <w:jc w:val="left"/>
+            </w:pPr>
+            <w:r/>
+            <w:r>
+              <w:rPr>
+                <w:rFonts w:ascii="Times New Roman" w:hAnsi="Times New Roman" w:eastAsia="Times New Roman" w:cs="Times New Roman"/>
+                <w:b w:val="0"/>
+                <w:i w:val="0"/>
+                <w:sz w:val="20"/>
+              </w:rPr>
+              <w:t>price book, billing delay, 3-day verification wait</w:t>
+            </w:r>
+          </w:p>
+        </w:tc>
+      </w:tr>
+      <w:tr>
+        <w:trPr>
+          <w:cantSplit w:val="true"/>
+        </w:trPr>
+        <w:tc>
+          <w:tcPr>
+            <w:tcW w:type="dxa" w:w="907"/>
+          </w:tcPr>
+          <w:p>
+            <w:pPr>
+              <w:keepNext/>
+              <w:spacing w:line="240" w:lineRule="auto" w:after="40"/>
+              <w:jc w:val="left"/>
+            </w:pPr>
+            <w:r/>
+            <w:r>
+              <w:rPr>
+                <w:rFonts w:ascii="Times New Roman" w:hAnsi="Times New Roman" w:eastAsia="Times New Roman" w:cs="Times New Roman"/>
+                <w:b w:val="0"/>
+                <w:i w:val="0"/>
+                <w:sz w:val="20"/>
+              </w:rPr>
+              <w:t>9</w:t>
+            </w:r>
+          </w:p>
+        </w:tc>
+        <w:tc>
+          <w:tcPr>
+            <w:tcW w:type="dxa" w:w="3061"/>
+          </w:tcPr>
+          <w:p>
+            <w:pPr>
+              <w:keepNext/>
+              <w:spacing w:line="240" w:lineRule="auto" w:after="40"/>
+              <w:jc w:val="left"/>
+            </w:pPr>
+            <w:r/>
+            <w:r>
+              <w:rPr>
+                <w:rFonts w:ascii="Times New Roman" w:hAnsi="Times New Roman" w:eastAsia="Times New Roman" w:cs="Times New Roman"/>
+                <w:b w:val="0"/>
+                <w:i w:val="0"/>
+                <w:sz w:val="20"/>
+              </w:rPr>
+              <w:t>FinOps</w:t>
+            </w:r>
+          </w:p>
+        </w:tc>
+        <w:tc>
+          <w:tcPr>
+            <w:tcW w:type="dxa" w:w="4535"/>
+          </w:tcPr>
+          <w:p>
+            <w:pPr>
+              <w:keepNext/>
+              <w:spacing w:line="240" w:lineRule="auto" w:after="40"/>
+              <w:jc w:val="left"/>
+            </w:pPr>
+            <w:r/>
+            <w:r>
+              <w:rPr>
+                <w:rFonts w:ascii="Times New Roman" w:hAnsi="Times New Roman" w:eastAsia="Times New Roman" w:cs="Times New Roman"/>
+                <w:b w:val="0"/>
+                <w:i w:val="0"/>
+                <w:sz w:val="20"/>
+              </w:rPr>
+              <w:t>inform, optimise, operate = the cost-to-action loop</w:t>
+            </w:r>
+          </w:p>
+        </w:tc>
+      </w:tr>
+      <w:tr>
+        <w:trPr>
+          <w:cantSplit w:val="true"/>
+        </w:trPr>
+        <w:tc>
+          <w:tcPr>
+            <w:tcW w:type="dxa" w:w="907"/>
+          </w:tcPr>
+          <w:p>
+            <w:pPr>
+              <w:keepNext/>
+              <w:spacing w:line="240" w:lineRule="auto" w:after="40"/>
+              <w:jc w:val="left"/>
+            </w:pPr>
+            <w:r/>
+            <w:r>
+              <w:rPr>
+                <w:rFonts w:ascii="Times New Roman" w:hAnsi="Times New Roman" w:eastAsia="Times New Roman" w:cs="Times New Roman"/>
+                <w:b w:val="0"/>
+                <w:i w:val="0"/>
+                <w:sz w:val="20"/>
+              </w:rPr>
+              <w:t>10</w:t>
+            </w:r>
+          </w:p>
+        </w:tc>
+        <w:tc>
+          <w:tcPr>
+            <w:tcW w:type="dxa" w:w="3061"/>
+          </w:tcPr>
+          <w:p>
+            <w:pPr>
+              <w:keepNext/>
+              <w:spacing w:line="240" w:lineRule="auto" w:after="40"/>
+              <w:jc w:val="left"/>
+            </w:pPr>
+            <w:r/>
+            <w:r>
+              <w:rPr>
+                <w:rFonts w:ascii="Times New Roman" w:hAnsi="Times New Roman" w:eastAsia="Times New Roman" w:cs="Times New Roman"/>
+                <w:b w:val="0"/>
+                <w:i w:val="0"/>
+                <w:sz w:val="20"/>
+              </w:rPr>
+              <w:t>Elasticity and scaling</w:t>
+            </w:r>
+          </w:p>
+        </w:tc>
+        <w:tc>
+          <w:tcPr>
+            <w:tcW w:type="dxa" w:w="4535"/>
+          </w:tcPr>
+          <w:p>
+            <w:pPr>
+              <w:keepNext/>
+              <w:spacing w:line="240" w:lineRule="auto" w:after="40"/>
+              <w:jc w:val="left"/>
+            </w:pPr>
+            <w:r/>
+            <w:r>
+              <w:rPr>
+                <w:rFonts w:ascii="Times New Roman" w:hAnsi="Times New Roman" w:eastAsia="Times New Roman" w:cs="Times New Roman"/>
+                <w:b w:val="0"/>
+                <w:i w:val="0"/>
+                <w:sz w:val="20"/>
+              </w:rPr>
+              <w:t>05-spike.sh anomaly test</w:t>
+            </w:r>
+          </w:p>
+        </w:tc>
+      </w:tr>
+      <w:tr>
+        <w:trPr>
+          <w:cantSplit w:val="true"/>
+        </w:trPr>
+        <w:tc>
+          <w:tcPr>
+            <w:tcW w:type="dxa" w:w="907"/>
+          </w:tcPr>
+          <w:p>
+            <w:pPr>
+              <w:keepNext/>
+              <w:spacing w:line="240" w:lineRule="auto" w:after="40"/>
+              <w:jc w:val="left"/>
+            </w:pPr>
+            <w:r/>
+            <w:r>
+              <w:rPr>
+                <w:rFonts w:ascii="Times New Roman" w:hAnsi="Times New Roman" w:eastAsia="Times New Roman" w:cs="Times New Roman"/>
+                <w:b w:val="0"/>
+                <w:i w:val="0"/>
+                <w:sz w:val="20"/>
+              </w:rPr>
+              <w:t>11</w:t>
+            </w:r>
+          </w:p>
+        </w:tc>
+        <w:tc>
+          <w:tcPr>
+            <w:tcW w:type="dxa" w:w="3061"/>
+          </w:tcPr>
+          <w:p>
+            <w:pPr>
+              <w:keepNext/>
+              <w:spacing w:line="240" w:lineRule="auto" w:after="40"/>
+              <w:jc w:val="left"/>
+            </w:pPr>
+            <w:r/>
+            <w:r>
+              <w:rPr>
+                <w:rFonts w:ascii="Times New Roman" w:hAnsi="Times New Roman" w:eastAsia="Times New Roman" w:cs="Times New Roman"/>
+                <w:b w:val="0"/>
+                <w:i w:val="0"/>
+                <w:sz w:val="20"/>
+              </w:rPr>
+              <w:t>Security and shared responsibility</w:t>
+            </w:r>
+          </w:p>
+        </w:tc>
+        <w:tc>
+          <w:tcPr>
+            <w:tcW w:type="dxa" w:w="4535"/>
+          </w:tcPr>
+          <w:p>
+            <w:pPr>
+              <w:keepNext/>
+              <w:spacing w:line="240" w:lineRule="auto" w:after="40"/>
+              <w:jc w:val="left"/>
+            </w:pPr>
+            <w:r/>
+            <w:r>
+              <w:rPr>
+                <w:rFonts w:ascii="Times New Roman" w:hAnsi="Times New Roman" w:eastAsia="Times New Roman" w:cs="Times New Roman"/>
+                <w:b w:val="0"/>
+                <w:i w:val="0"/>
+                <w:sz w:val="20"/>
+              </w:rPr>
+              <w:t>Fernet, scrypt, read-only collector</w:t>
+            </w:r>
+          </w:p>
+        </w:tc>
+      </w:tr>
+      <w:tr>
+        <w:trPr>
+          <w:cantSplit w:val="true"/>
+        </w:trPr>
+        <w:tc>
+          <w:tcPr>
+            <w:tcW w:type="dxa" w:w="907"/>
+          </w:tcPr>
+          <w:p>
+            <w:pPr>
+              <w:spacing w:line="240" w:lineRule="auto" w:after="40"/>
+              <w:jc w:val="left"/>
+            </w:pPr>
+            <w:r/>
+            <w:r>
+              <w:rPr>
+                <w:rFonts w:ascii="Times New Roman" w:hAnsi="Times New Roman" w:eastAsia="Times New Roman" w:cs="Times New Roman"/>
+                <w:b w:val="0"/>
+                <w:i w:val="0"/>
+                <w:sz w:val="20"/>
+              </w:rPr>
+              <w:t>12</w:t>
+            </w:r>
+          </w:p>
+        </w:tc>
+        <w:tc>
+          <w:tcPr>
+            <w:tcW w:type="dxa" w:w="3061"/>
+          </w:tcPr>
+          <w:p>
+            <w:pPr>
+              <w:spacing w:line="240" w:lineRule="auto" w:after="40"/>
+              <w:jc w:val="left"/>
+            </w:pPr>
+            <w:r/>
+            <w:r>
+              <w:rPr>
+                <w:rFonts w:ascii="Times New Roman" w:hAnsi="Times New Roman" w:eastAsia="Times New Roman" w:cs="Times New Roman"/>
+                <w:b w:val="0"/>
+                <w:i w:val="0"/>
+                <w:sz w:val="20"/>
+              </w:rPr>
+              <w:t>Automation, containers, DevOps</w:t>
+            </w:r>
+          </w:p>
+        </w:tc>
+        <w:tc>
+          <w:tcPr>
+            <w:tcW w:type="dxa" w:w="4535"/>
+          </w:tcPr>
+          <w:p>
+            <w:pPr>
+              <w:spacing w:line="240" w:lineRule="auto" w:after="40"/>
+              <w:jc w:val="left"/>
+            </w:pPr>
+            <w:r/>
+            <w:r>
+              <w:rPr>
+                <w:rFonts w:ascii="Times New Roman" w:hAnsi="Times New Roman" w:eastAsia="Times New Roman" w:cs="Times New Roman"/>
+                <w:b w:val="0"/>
+                <w:i w:val="0"/>
+                <w:sz w:val="20"/>
+              </w:rPr>
+              <w:t>Azure CLI scripts, Docker, Render, App Service, CI</w:t>
             </w:r>
           </w:p>
         </w:tc>

</xml_diff>